<commit_message>
add list of sources
</commit_message>
<xml_diff>
--- a/22ДЦИ_2_МайзетАВ_практика_4курс.docx
+++ b/22ДЦИ_2_МайзетАВ_практика_4курс.docx
@@ -2597,11 +2597,6 @@
       </w:r>
     </w:p>
     <w:p>
-      <w:pPr>
-        <w:rPr>
-          <w:lang w:val="en-US"/>
-        </w:rPr>
-      </w:pPr>
       <w:r>
         <w:rPr>
           <w:rStyle w:val="a3"/>
@@ -3184,6 +3179,17 @@
           <w:sz w:val="28"/>
           <w:szCs w:val="28"/>
           <w:shd w:val="clear" w:color="auto" w:fill="FFFFFF"/>
+          <w:lang w:val="ru-RU"/>
+        </w:rPr>
+        <w:t>[1]</w:t>
+      </w:r>
+      <w:r>
+        <w:rPr>
+          <w:rFonts w:ascii="Times New Roman" w:hAnsi="Times New Roman"/>
+          <w:color w:val="0F1115"/>
+          <w:sz w:val="28"/>
+          <w:szCs w:val="28"/>
+          <w:shd w:val="clear" w:color="auto" w:fill="FFFFFF"/>
         </w:rPr>
         <w:t>.</w:t>
       </w:r>
@@ -3371,6 +3377,39 @@
           <w:sz w:val="28"/>
           <w:szCs w:val="28"/>
           <w:shd w:val="clear" w:color="auto" w:fill="FFFFFF"/>
+          <w:lang w:val="ru-RU"/>
+        </w:rPr>
+        <w:t>[</w:t>
+      </w:r>
+      <w:r>
+        <w:rPr>
+          <w:rFonts w:ascii="Times New Roman" w:hAnsi="Times New Roman"/>
+          <w:color w:val="0F1115"/>
+          <w:sz w:val="28"/>
+          <w:szCs w:val="28"/>
+          <w:shd w:val="clear" w:color="auto" w:fill="FFFFFF"/>
+          <w:lang w:val="en-US"/>
+        </w:rPr>
+        <w:t>1</w:t>
+      </w:r>
+      <w:r>
+        <w:rPr>
+          <w:rFonts w:ascii="Times New Roman" w:hAnsi="Times New Roman"/>
+          <w:color w:val="0F1115"/>
+          <w:sz w:val="28"/>
+          <w:szCs w:val="28"/>
+          <w:shd w:val="clear" w:color="auto" w:fill="FFFFFF"/>
+          <w:lang w:val="ru-RU"/>
+        </w:rPr>
+        <w:t>]</w:t>
+      </w:r>
+      <w:r>
+        <w:rPr>
+          <w:rFonts w:ascii="Times New Roman" w:hAnsi="Times New Roman"/>
+          <w:color w:val="0F1115"/>
+          <w:sz w:val="28"/>
+          <w:szCs w:val="28"/>
+          <w:shd w:val="clear" w:color="auto" w:fill="FFFFFF"/>
         </w:rPr>
         <w:t>.</w:t>
       </w:r>
@@ -4030,6 +4069,17 @@
           <w:sz w:val="28"/>
           <w:szCs w:val="28"/>
           <w:shd w:val="clear" w:color="auto" w:fill="FFFFFF"/>
+          <w:lang w:val="ru-RU"/>
+        </w:rPr>
+        <w:t>[1]</w:t>
+      </w:r>
+      <w:r>
+        <w:rPr>
+          <w:rFonts w:ascii="Times New Roman" w:hAnsi="Times New Roman"/>
+          <w:color w:val="0F1115"/>
+          <w:sz w:val="28"/>
+          <w:szCs w:val="28"/>
+          <w:shd w:val="clear" w:color="auto" w:fill="FFFFFF"/>
         </w:rPr>
         <w:t>.</w:t>
       </w:r>
@@ -5514,6 +5564,17 @@
           <w:sz w:val="28"/>
           <w:szCs w:val="28"/>
           <w:shd w:val="clear" w:color="auto" w:fill="FFFFFF"/>
+          <w:lang w:val="ru-RU"/>
+        </w:rPr>
+        <w:t>[1]</w:t>
+      </w:r>
+      <w:r>
+        <w:rPr>
+          <w:rFonts w:ascii="Times New Roman" w:hAnsi="Times New Roman"/>
+          <w:color w:val="0F1115"/>
+          <w:sz w:val="28"/>
+          <w:szCs w:val="28"/>
+          <w:shd w:val="clear" w:color="auto" w:fill="FFFFFF"/>
         </w:rPr>
         <w:t>.</w:t>
       </w:r>
@@ -6142,6 +6203,17 @@
           <w:sz w:val="28"/>
           <w:szCs w:val="28"/>
           <w:shd w:val="clear" w:color="auto" w:fill="FFFFFF"/>
+          <w:lang w:val="ru-RU"/>
+        </w:rPr>
+        <w:t>[1]</w:t>
+      </w:r>
+      <w:r>
+        <w:rPr>
+          <w:rFonts w:ascii="Times New Roman" w:hAnsi="Times New Roman"/>
+          <w:color w:val="0F1115"/>
+          <w:sz w:val="28"/>
+          <w:szCs w:val="28"/>
+          <w:shd w:val="clear" w:color="auto" w:fill="FFFFFF"/>
         </w:rPr>
         <w:t>.</w:t>
       </w:r>
@@ -6449,6 +6521,39 @@
           <w:sz w:val="28"/>
           <w:szCs w:val="28"/>
           <w:shd w:val="clear" w:color="auto" w:fill="FFFFFF"/>
+          <w:lang w:val="ru-RU"/>
+        </w:rPr>
+        <w:t>[</w:t>
+      </w:r>
+      <w:r>
+        <w:rPr>
+          <w:rFonts w:ascii="Times New Roman" w:hAnsi="Times New Roman"/>
+          <w:color w:val="0F1115"/>
+          <w:sz w:val="28"/>
+          <w:szCs w:val="28"/>
+          <w:shd w:val="clear" w:color="auto" w:fill="FFFFFF"/>
+          <w:lang w:val="ru-RU"/>
+        </w:rPr>
+        <w:t>3</w:t>
+      </w:r>
+      <w:r>
+        <w:rPr>
+          <w:rFonts w:ascii="Times New Roman" w:hAnsi="Times New Roman"/>
+          <w:color w:val="0F1115"/>
+          <w:sz w:val="28"/>
+          <w:szCs w:val="28"/>
+          <w:shd w:val="clear" w:color="auto" w:fill="FFFFFF"/>
+          <w:lang w:val="ru-RU"/>
+        </w:rPr>
+        <w:t>]</w:t>
+      </w:r>
+      <w:r>
+        <w:rPr>
+          <w:rFonts w:ascii="Times New Roman" w:hAnsi="Times New Roman"/>
+          <w:color w:val="0F1115"/>
+          <w:sz w:val="28"/>
+          <w:szCs w:val="28"/>
+          <w:shd w:val="clear" w:color="auto" w:fill="FFFFFF"/>
         </w:rPr>
         <w:t>.</w:t>
       </w:r>
@@ -6616,6 +6721,39 @@
           <w:sz w:val="28"/>
           <w:szCs w:val="28"/>
           <w:shd w:val="clear" w:color="auto" w:fill="FFFFFF"/>
+          <w:lang w:val="ru-RU"/>
+        </w:rPr>
+        <w:t>[</w:t>
+      </w:r>
+      <w:r>
+        <w:rPr>
+          <w:rFonts w:ascii="Times New Roman" w:hAnsi="Times New Roman"/>
+          <w:color w:val="0F1115"/>
+          <w:sz w:val="28"/>
+          <w:szCs w:val="28"/>
+          <w:shd w:val="clear" w:color="auto" w:fill="FFFFFF"/>
+          <w:lang w:val="ru-RU"/>
+        </w:rPr>
+        <w:t>7</w:t>
+      </w:r>
+      <w:r>
+        <w:rPr>
+          <w:rFonts w:ascii="Times New Roman" w:hAnsi="Times New Roman"/>
+          <w:color w:val="0F1115"/>
+          <w:sz w:val="28"/>
+          <w:szCs w:val="28"/>
+          <w:shd w:val="clear" w:color="auto" w:fill="FFFFFF"/>
+          <w:lang w:val="ru-RU"/>
+        </w:rPr>
+        <w:t>]</w:t>
+      </w:r>
+      <w:r>
+        <w:rPr>
+          <w:rFonts w:ascii="Times New Roman" w:hAnsi="Times New Roman"/>
+          <w:color w:val="0F1115"/>
+          <w:sz w:val="28"/>
+          <w:szCs w:val="28"/>
+          <w:shd w:val="clear" w:color="auto" w:fill="FFFFFF"/>
         </w:rPr>
         <w:t>.</w:t>
       </w:r>
@@ -7185,6 +7323,9 @@
         <w:jc w:val="center"/>
       </w:pPr>
       <w:r>
+        <w:rPr>
+          <w:noProof/>
+        </w:rPr>
         <w:lastRenderedPageBreak/>
         <w:drawing>
           <wp:inline distT="0" distB="0" distL="0" distR="0" wp14:anchorId="5C6F5782" wp14:editId="367D0160">
@@ -7506,6 +7647,17 @@
           <w:sz w:val="28"/>
           <w:szCs w:val="28"/>
           <w:shd w:val="clear" w:color="auto" w:fill="FFFFFF"/>
+          <w:lang w:val="ru-RU"/>
+        </w:rPr>
+        <w:t>[1]</w:t>
+      </w:r>
+      <w:r>
+        <w:rPr>
+          <w:rFonts w:ascii="Times New Roman" w:hAnsi="Times New Roman"/>
+          <w:color w:val="0F1115"/>
+          <w:sz w:val="28"/>
+          <w:szCs w:val="28"/>
+          <w:shd w:val="clear" w:color="auto" w:fill="FFFFFF"/>
         </w:rPr>
         <w:t>.</w:t>
       </w:r>
@@ -7706,18 +7858,7 @@
           <w:shd w:val="clear" w:color="auto" w:fill="FFFFFF"/>
           <w:lang w:val="ru-RU"/>
         </w:rPr>
-        <w:t>В Контакт-центре представлены такие должности, как директор, заместитель директора, начальники отделов (разработки, сопровождения, тестирования), специалисты первой и второй категории</w:t>
-      </w:r>
-      <w:r>
-        <w:rPr>
-          <w:rFonts w:ascii="Times New Roman" w:hAnsi="Times New Roman"/>
-          <w:color w:val="0F1115"/>
-          <w:sz w:val="28"/>
-          <w:szCs w:val="28"/>
-          <w:shd w:val="clear" w:color="auto" w:fill="FFFFFF"/>
-          <w:lang w:val="ru-RU"/>
-        </w:rPr>
-        <w:t>.</w:t>
+        <w:t>В Контакт-центре представлены такие должности, как директор, заместитель директора, начальники отделов (разработки, сопровождения, тестирования), специалисты первой и второй категории.</w:t>
       </w:r>
     </w:p>
     <w:p>
@@ -8209,6 +8350,39 @@
           <w:sz w:val="28"/>
           <w:szCs w:val="28"/>
           <w:shd w:val="clear" w:color="auto" w:fill="FFFFFF"/>
+          <w:lang w:val="ru-RU"/>
+        </w:rPr>
+        <w:t>[</w:t>
+      </w:r>
+      <w:r>
+        <w:rPr>
+          <w:rFonts w:ascii="Times New Roman" w:hAnsi="Times New Roman"/>
+          <w:color w:val="0F1115"/>
+          <w:sz w:val="28"/>
+          <w:szCs w:val="28"/>
+          <w:shd w:val="clear" w:color="auto" w:fill="FFFFFF"/>
+          <w:lang w:val="ru-RU"/>
+        </w:rPr>
+        <w:t>6</w:t>
+      </w:r>
+      <w:r>
+        <w:rPr>
+          <w:rFonts w:ascii="Times New Roman" w:hAnsi="Times New Roman"/>
+          <w:color w:val="0F1115"/>
+          <w:sz w:val="28"/>
+          <w:szCs w:val="28"/>
+          <w:shd w:val="clear" w:color="auto" w:fill="FFFFFF"/>
+          <w:lang w:val="ru-RU"/>
+        </w:rPr>
+        <w:t>]</w:t>
+      </w:r>
+      <w:r>
+        <w:rPr>
+          <w:rFonts w:ascii="Times New Roman" w:hAnsi="Times New Roman"/>
+          <w:color w:val="0F1115"/>
+          <w:sz w:val="28"/>
+          <w:szCs w:val="28"/>
+          <w:shd w:val="clear" w:color="auto" w:fill="FFFFFF"/>
         </w:rPr>
         <w:t>.</w:t>
       </w:r>
@@ -9015,6 +9189,39 @@
           <w:sz w:val="28"/>
           <w:szCs w:val="28"/>
           <w:shd w:val="clear" w:color="auto" w:fill="FFFFFF"/>
+          <w:lang w:val="ru-RU"/>
+        </w:rPr>
+        <w:t>[</w:t>
+      </w:r>
+      <w:r>
+        <w:rPr>
+          <w:rFonts w:ascii="Times New Roman" w:hAnsi="Times New Roman"/>
+          <w:color w:val="0F1115"/>
+          <w:sz w:val="28"/>
+          <w:szCs w:val="28"/>
+          <w:shd w:val="clear" w:color="auto" w:fill="FFFFFF"/>
+          <w:lang w:val="ru-RU"/>
+        </w:rPr>
+        <w:t>8</w:t>
+      </w:r>
+      <w:r>
+        <w:rPr>
+          <w:rFonts w:ascii="Times New Roman" w:hAnsi="Times New Roman"/>
+          <w:color w:val="0F1115"/>
+          <w:sz w:val="28"/>
+          <w:szCs w:val="28"/>
+          <w:shd w:val="clear" w:color="auto" w:fill="FFFFFF"/>
+          <w:lang w:val="ru-RU"/>
+        </w:rPr>
+        <w:t>]</w:t>
+      </w:r>
+      <w:r>
+        <w:rPr>
+          <w:rFonts w:ascii="Times New Roman" w:hAnsi="Times New Roman"/>
+          <w:color w:val="0F1115"/>
+          <w:sz w:val="28"/>
+          <w:szCs w:val="28"/>
+          <w:shd w:val="clear" w:color="auto" w:fill="FFFFFF"/>
         </w:rPr>
         <w:t>.</w:t>
       </w:r>
@@ -10003,7 +10210,40 @@
           <w:lang w:val="ru-RU"/>
         </w:rPr>
         <w:lastRenderedPageBreak/>
-        <w:t>существующими банковскими решениями и облегчает взаимодействие с нерезидентами </w:t>
+        <w:t>существующими банковскими решениями и облегчает взаимодействие с нерезидентами</w:t>
+      </w:r>
+      <w:r>
+        <w:rPr>
+          <w:rFonts w:ascii="Times New Roman" w:hAnsi="Times New Roman"/>
+          <w:color w:val="0F1115"/>
+          <w:sz w:val="28"/>
+          <w:szCs w:val="28"/>
+          <w:shd w:val="clear" w:color="auto" w:fill="FFFFFF"/>
+          <w:lang w:val="ru-RU"/>
+        </w:rPr>
+        <w:t>[</w:t>
+      </w:r>
+      <w:r>
+        <w:rPr>
+          <w:rFonts w:ascii="Times New Roman" w:hAnsi="Times New Roman"/>
+          <w:color w:val="0F1115"/>
+          <w:sz w:val="28"/>
+          <w:szCs w:val="28"/>
+          <w:shd w:val="clear" w:color="auto" w:fill="FFFFFF"/>
+          <w:lang w:val="ru-RU"/>
+        </w:rPr>
+        <w:t>4</w:t>
+      </w:r>
+      <w:r>
+        <w:rPr>
+          <w:rFonts w:ascii="Times New Roman" w:hAnsi="Times New Roman"/>
+          <w:color w:val="0F1115"/>
+          <w:sz w:val="28"/>
+          <w:szCs w:val="28"/>
+          <w:shd w:val="clear" w:color="auto" w:fill="FFFFFF"/>
+          <w:lang w:val="ru-RU"/>
+        </w:rPr>
+        <w:t>]</w:t>
       </w:r>
       <w:r>
         <w:rPr>
@@ -10971,6 +11211,39 @@
           <w:sz w:val="28"/>
           <w:szCs w:val="28"/>
           <w:shd w:val="clear" w:color="auto" w:fill="FFFFFF"/>
+          <w:lang w:val="ru-RU"/>
+        </w:rPr>
+        <w:t>[</w:t>
+      </w:r>
+      <w:r>
+        <w:rPr>
+          <w:rFonts w:ascii="Times New Roman" w:hAnsi="Times New Roman"/>
+          <w:color w:val="0F1115"/>
+          <w:sz w:val="28"/>
+          <w:szCs w:val="28"/>
+          <w:shd w:val="clear" w:color="auto" w:fill="FFFFFF"/>
+          <w:lang w:val="ru-RU"/>
+        </w:rPr>
+        <w:t>9</w:t>
+      </w:r>
+      <w:r>
+        <w:rPr>
+          <w:rFonts w:ascii="Times New Roman" w:hAnsi="Times New Roman"/>
+          <w:color w:val="0F1115"/>
+          <w:sz w:val="28"/>
+          <w:szCs w:val="28"/>
+          <w:shd w:val="clear" w:color="auto" w:fill="FFFFFF"/>
+          <w:lang w:val="ru-RU"/>
+        </w:rPr>
+        <w:t>]</w:t>
+      </w:r>
+      <w:r>
+        <w:rPr>
+          <w:rFonts w:ascii="Times New Roman" w:hAnsi="Times New Roman"/>
+          <w:color w:val="0F1115"/>
+          <w:sz w:val="28"/>
+          <w:szCs w:val="28"/>
+          <w:shd w:val="clear" w:color="auto" w:fill="FFFFFF"/>
         </w:rPr>
         <w:t>.</w:t>
       </w:r>
@@ -11504,6 +11777,17 @@
           <w:sz w:val="28"/>
           <w:szCs w:val="28"/>
           <w:shd w:val="clear" w:color="auto" w:fill="FFFFFF"/>
+          <w:lang w:val="ru-RU"/>
+        </w:rPr>
+        <w:t>[1]</w:t>
+      </w:r>
+      <w:r>
+        <w:rPr>
+          <w:rFonts w:ascii="Times New Roman" w:hAnsi="Times New Roman"/>
+          <w:color w:val="0F1115"/>
+          <w:sz w:val="28"/>
+          <w:szCs w:val="28"/>
+          <w:shd w:val="clear" w:color="auto" w:fill="FFFFFF"/>
         </w:rPr>
         <w:t>.</w:t>
       </w:r>
@@ -12824,6 +13108,17 @@
           <w:sz w:val="28"/>
           <w:szCs w:val="28"/>
           <w:shd w:val="clear" w:color="auto" w:fill="FFFFFF"/>
+          <w:lang w:val="ru-RU"/>
+        </w:rPr>
+        <w:t>[1]</w:t>
+      </w:r>
+      <w:r>
+        <w:rPr>
+          <w:rFonts w:ascii="Times New Roman" w:hAnsi="Times New Roman"/>
+          <w:color w:val="0F1115"/>
+          <w:sz w:val="28"/>
+          <w:szCs w:val="28"/>
+          <w:shd w:val="clear" w:color="auto" w:fill="FFFFFF"/>
         </w:rPr>
         <w:t>.</w:t>
       </w:r>
@@ -13137,6 +13432,17 @@
           <w:sz w:val="28"/>
           <w:szCs w:val="28"/>
           <w:shd w:val="clear" w:color="auto" w:fill="FFFFFF"/>
+          <w:lang w:val="ru-RU"/>
+        </w:rPr>
+        <w:t>[1]</w:t>
+      </w:r>
+      <w:r>
+        <w:rPr>
+          <w:rFonts w:ascii="Times New Roman" w:hAnsi="Times New Roman"/>
+          <w:color w:val="0F1115"/>
+          <w:sz w:val="28"/>
+          <w:szCs w:val="28"/>
+          <w:shd w:val="clear" w:color="auto" w:fill="FFFFFF"/>
         </w:rPr>
         <w:t>.</w:t>
       </w:r>
@@ -13453,6 +13759,39 @@
           <w:sz w:val="28"/>
           <w:szCs w:val="28"/>
           <w:shd w:val="clear" w:color="auto" w:fill="FFFFFF"/>
+          <w:lang w:val="ru-RU"/>
+        </w:rPr>
+        <w:t>[</w:t>
+      </w:r>
+      <w:r>
+        <w:rPr>
+          <w:rFonts w:ascii="Times New Roman" w:hAnsi="Times New Roman"/>
+          <w:color w:val="0F1115"/>
+          <w:sz w:val="28"/>
+          <w:szCs w:val="28"/>
+          <w:shd w:val="clear" w:color="auto" w:fill="FFFFFF"/>
+          <w:lang w:val="ru-RU"/>
+        </w:rPr>
+        <w:t>5</w:t>
+      </w:r>
+      <w:r>
+        <w:rPr>
+          <w:rFonts w:ascii="Times New Roman" w:hAnsi="Times New Roman"/>
+          <w:color w:val="0F1115"/>
+          <w:sz w:val="28"/>
+          <w:szCs w:val="28"/>
+          <w:shd w:val="clear" w:color="auto" w:fill="FFFFFF"/>
+          <w:lang w:val="ru-RU"/>
+        </w:rPr>
+        <w:t>]</w:t>
+      </w:r>
+      <w:r>
+        <w:rPr>
+          <w:rFonts w:ascii="Times New Roman" w:hAnsi="Times New Roman"/>
+          <w:color w:val="0F1115"/>
+          <w:sz w:val="28"/>
+          <w:szCs w:val="28"/>
+          <w:shd w:val="clear" w:color="auto" w:fill="FFFFFF"/>
         </w:rPr>
         <w:t>.</w:t>
       </w:r>
@@ -14180,6 +14519,17 @@
           <w:sz w:val="28"/>
           <w:szCs w:val="28"/>
           <w:shd w:val="clear" w:color="auto" w:fill="FFFFFF"/>
+          <w:lang w:val="ru-RU"/>
+        </w:rPr>
+        <w:t>[1]</w:t>
+      </w:r>
+      <w:r>
+        <w:rPr>
+          <w:rFonts w:ascii="Times New Roman" w:hAnsi="Times New Roman"/>
+          <w:color w:val="0F1115"/>
+          <w:sz w:val="28"/>
+          <w:szCs w:val="28"/>
+          <w:shd w:val="clear" w:color="auto" w:fill="FFFFFF"/>
         </w:rPr>
         <w:t>.</w:t>
       </w:r>
@@ -14536,7 +14886,61 @@
           <w:szCs w:val="28"/>
           <w:shd w:val="clear" w:color="auto" w:fill="FFFFFF"/>
         </w:rPr>
-        <w:t>).</w:t>
+        <w:t>)</w:t>
+      </w:r>
+      <w:r>
+        <w:rPr>
+          <w:rFonts w:ascii="Times New Roman" w:hAnsi="Times New Roman"/>
+          <w:color w:val="0F1115"/>
+          <w:sz w:val="28"/>
+          <w:szCs w:val="28"/>
+          <w:shd w:val="clear" w:color="auto" w:fill="FFFFFF"/>
+          <w:lang w:val="ru-RU"/>
+        </w:rPr>
+        <w:t xml:space="preserve"> </w:t>
+      </w:r>
+      <w:r>
+        <w:rPr>
+          <w:rFonts w:ascii="Times New Roman" w:hAnsi="Times New Roman"/>
+          <w:color w:val="0F1115"/>
+          <w:sz w:val="28"/>
+          <w:szCs w:val="28"/>
+          <w:shd w:val="clear" w:color="auto" w:fill="FFFFFF"/>
+          <w:lang w:val="ru-RU"/>
+        </w:rPr>
+        <w:t>[</w:t>
+      </w:r>
+      <w:r>
+        <w:rPr>
+          <w:rFonts w:ascii="Times New Roman" w:hAnsi="Times New Roman"/>
+          <w:color w:val="0F1115"/>
+          <w:sz w:val="28"/>
+          <w:szCs w:val="28"/>
+          <w:shd w:val="clear" w:color="auto" w:fill="FFFFFF"/>
+          <w:lang w:val="ru-RU"/>
+        </w:rPr>
+        <w:t>11</w:t>
+      </w:r>
+      <w:r>
+        <w:rPr>
+          <w:rFonts w:ascii="Times New Roman" w:hAnsi="Times New Roman"/>
+          <w:color w:val="0F1115"/>
+          <w:sz w:val="28"/>
+          <w:szCs w:val="28"/>
+          <w:shd w:val="clear" w:color="auto" w:fill="FFFFFF"/>
+          <w:lang w:val="ru-RU"/>
+        </w:rPr>
+        <w:t>]</w:t>
+      </w:r>
+      <w:r>
+        <w:rPr>
+          <w:rFonts w:ascii="Times New Roman" w:hAnsi="Times New Roman"/>
+          <w:color w:val="0F1115"/>
+          <w:sz w:val="28"/>
+          <w:szCs w:val="28"/>
+          <w:shd w:val="clear" w:color="auto" w:fill="FFFFFF"/>
+        </w:rPr>
+        <w:t>.</w:t>
       </w:r>
     </w:p>
     <w:p>
@@ -15488,6 +15892,8 @@
         <w:jc w:val="both"/>
         <w:rPr>
           <w:rFonts w:ascii="Times New Roman" w:eastAsia="Times New Roman" w:hAnsi="Times New Roman" w:cs="Times New Roman"/>
+          <w:b/>
+          <w:bCs/>
           <w:color w:val="0F1115"/>
           <w:sz w:val="28"/>
           <w:szCs w:val="28"/>
@@ -15913,6 +16319,39 @@
           <w:lang w:val="ru-RU"/>
         </w:rPr>
         <w:t>а также в сборе информации для улучшения функциональности электронных ресурсов банка</w:t>
+      </w:r>
+      <w:r>
+        <w:rPr>
+          <w:rFonts w:ascii="Times New Roman" w:hAnsi="Times New Roman"/>
+          <w:color w:val="0F1115"/>
+          <w:sz w:val="28"/>
+          <w:szCs w:val="28"/>
+          <w:shd w:val="clear" w:color="auto" w:fill="FFFFFF"/>
+          <w:lang w:val="ru-RU"/>
+        </w:rPr>
+        <w:t>[1</w:t>
+      </w:r>
+      <w:r>
+        <w:rPr>
+          <w:rFonts w:ascii="Times New Roman" w:hAnsi="Times New Roman"/>
+          <w:color w:val="0F1115"/>
+          <w:sz w:val="28"/>
+          <w:szCs w:val="28"/>
+          <w:shd w:val="clear" w:color="auto" w:fill="FFFFFF"/>
+          <w:lang w:val="ru-RU"/>
+        </w:rPr>
+        <w:t>1</w:t>
+      </w:r>
+      <w:r>
+        <w:rPr>
+          <w:rFonts w:ascii="Times New Roman" w:hAnsi="Times New Roman"/>
+          <w:color w:val="0F1115"/>
+          <w:sz w:val="28"/>
+          <w:szCs w:val="28"/>
+          <w:shd w:val="clear" w:color="auto" w:fill="FFFFFF"/>
+          <w:lang w:val="ru-RU"/>
+        </w:rPr>
+        <w:t>]</w:t>
       </w:r>
       <w:r>
         <w:rPr>
@@ -16374,6 +16813,39 @@
           <w:sz w:val="28"/>
           <w:szCs w:val="28"/>
           <w:shd w:val="clear" w:color="auto" w:fill="FFFFFF"/>
+          <w:lang w:val="ru-RU"/>
+        </w:rPr>
+        <w:t>[1</w:t>
+      </w:r>
+      <w:r>
+        <w:rPr>
+          <w:rFonts w:ascii="Times New Roman" w:hAnsi="Times New Roman"/>
+          <w:color w:val="0F1115"/>
+          <w:sz w:val="28"/>
+          <w:szCs w:val="28"/>
+          <w:shd w:val="clear" w:color="auto" w:fill="FFFFFF"/>
+          <w:lang w:val="ru-RU"/>
+        </w:rPr>
+        <w:t>1</w:t>
+      </w:r>
+      <w:r>
+        <w:rPr>
+          <w:rFonts w:ascii="Times New Roman" w:hAnsi="Times New Roman"/>
+          <w:color w:val="0F1115"/>
+          <w:sz w:val="28"/>
+          <w:szCs w:val="28"/>
+          <w:shd w:val="clear" w:color="auto" w:fill="FFFFFF"/>
+          <w:lang w:val="ru-RU"/>
+        </w:rPr>
+        <w:t>]</w:t>
+      </w:r>
+      <w:r>
+        <w:rPr>
+          <w:rFonts w:ascii="Times New Roman" w:hAnsi="Times New Roman"/>
+          <w:color w:val="0F1115"/>
+          <w:sz w:val="28"/>
+          <w:szCs w:val="28"/>
+          <w:shd w:val="clear" w:color="auto" w:fill="FFFFFF"/>
         </w:rPr>
         <w:t>.</w:t>
       </w:r>
@@ -18201,7 +18673,40 @@
           <w:shd w:val="clear" w:color="auto" w:fill="FFFFFF"/>
           <w:lang w:val="ru-RU"/>
         </w:rPr>
-        <w:t>обеспечивающее автоматизацию и контроль процессов управления ИТ </w:t>
+        <w:t>обеспечивающее автоматизацию и контроль процессов управления ИТ</w:t>
+      </w:r>
+      <w:r>
+        <w:rPr>
+          <w:rFonts w:ascii="Times New Roman" w:hAnsi="Times New Roman"/>
+          <w:color w:val="0F1115"/>
+          <w:sz w:val="28"/>
+          <w:szCs w:val="28"/>
+          <w:shd w:val="clear" w:color="auto" w:fill="FFFFFF"/>
+          <w:lang w:val="ru-RU"/>
+        </w:rPr>
+        <w:t>[</w:t>
+      </w:r>
+      <w:r>
+        <w:rPr>
+          <w:rFonts w:ascii="Times New Roman" w:hAnsi="Times New Roman"/>
+          <w:color w:val="0F1115"/>
+          <w:sz w:val="28"/>
+          <w:szCs w:val="28"/>
+          <w:shd w:val="clear" w:color="auto" w:fill="FFFFFF"/>
+          <w:lang w:val="ru-RU"/>
+        </w:rPr>
+        <w:t>13</w:t>
+      </w:r>
+      <w:r>
+        <w:rPr>
+          <w:rFonts w:ascii="Times New Roman" w:hAnsi="Times New Roman"/>
+          <w:color w:val="0F1115"/>
+          <w:sz w:val="28"/>
+          <w:szCs w:val="28"/>
+          <w:shd w:val="clear" w:color="auto" w:fill="FFFFFF"/>
+          <w:lang w:val="ru-RU"/>
+        </w:rPr>
+        <w:t>]</w:t>
       </w:r>
       <w:r>
         <w:rPr>
@@ -19270,7 +19775,50 @@
           <w:szCs w:val="28"/>
           <w:shd w:val="clear" w:color="auto" w:fill="FFFFFF"/>
         </w:rPr>
-        <w:t>и ISO 20022.</w:t>
+        <w:t>и ISO 20022</w:t>
+      </w:r>
+      <w:r>
+        <w:rPr>
+          <w:rFonts w:ascii="Times New Roman" w:hAnsi="Times New Roman"/>
+          <w:color w:val="0F1115"/>
+          <w:sz w:val="28"/>
+          <w:szCs w:val="28"/>
+          <w:shd w:val="clear" w:color="auto" w:fill="FFFFFF"/>
+          <w:lang w:val="ru-RU"/>
+        </w:rPr>
+        <w:t>[1</w:t>
+      </w:r>
+      <w:r>
+        <w:rPr>
+          <w:rFonts w:ascii="Times New Roman" w:hAnsi="Times New Roman"/>
+          <w:color w:val="0F1115"/>
+          <w:sz w:val="28"/>
+          <w:szCs w:val="28"/>
+          <w:shd w:val="clear" w:color="auto" w:fill="FFFFFF"/>
+          <w:lang w:val="ru-RU"/>
+        </w:rPr>
+        <w:t>3</w:t>
+      </w:r>
+      <w:r>
+        <w:rPr>
+          <w:rFonts w:ascii="Times New Roman" w:hAnsi="Times New Roman"/>
+          <w:color w:val="0F1115"/>
+          <w:sz w:val="28"/>
+          <w:szCs w:val="28"/>
+          <w:shd w:val="clear" w:color="auto" w:fill="FFFFFF"/>
+          <w:lang w:val="ru-RU"/>
+        </w:rPr>
+        <w:t>]</w:t>
+      </w:r>
+      <w:r>
+        <w:rPr>
+          <w:rFonts w:ascii="Times New Roman" w:hAnsi="Times New Roman"/>
+          <w:color w:val="0F1115"/>
+          <w:sz w:val="28"/>
+          <w:szCs w:val="28"/>
+          <w:shd w:val="clear" w:color="auto" w:fill="FFFFFF"/>
+        </w:rPr>
+        <w:t>.</w:t>
       </w:r>
     </w:p>
     <w:p>
@@ -21654,6 +22202,39 @@
           <w:sz w:val="28"/>
           <w:szCs w:val="28"/>
           <w:shd w:val="clear" w:color="auto" w:fill="FFFFFF"/>
+          <w:lang w:val="ru-RU"/>
+        </w:rPr>
+        <w:t>[</w:t>
+      </w:r>
+      <w:r>
+        <w:rPr>
+          <w:rFonts w:ascii="Times New Roman" w:hAnsi="Times New Roman"/>
+          <w:color w:val="0F1115"/>
+          <w:sz w:val="28"/>
+          <w:szCs w:val="28"/>
+          <w:shd w:val="clear" w:color="auto" w:fill="FFFFFF"/>
+          <w:lang w:val="ru-RU"/>
+        </w:rPr>
+        <w:t>4</w:t>
+      </w:r>
+      <w:r>
+        <w:rPr>
+          <w:rFonts w:ascii="Times New Roman" w:hAnsi="Times New Roman"/>
+          <w:color w:val="0F1115"/>
+          <w:sz w:val="28"/>
+          <w:szCs w:val="28"/>
+          <w:shd w:val="clear" w:color="auto" w:fill="FFFFFF"/>
+          <w:lang w:val="ru-RU"/>
+        </w:rPr>
+        <w:t>]</w:t>
+      </w:r>
+      <w:r>
+        <w:rPr>
+          <w:rFonts w:ascii="Times New Roman" w:hAnsi="Times New Roman"/>
+          <w:color w:val="0F1115"/>
+          <w:sz w:val="28"/>
+          <w:szCs w:val="28"/>
+          <w:shd w:val="clear" w:color="auto" w:fill="FFFFFF"/>
         </w:rPr>
         <w:t>.</w:t>
       </w:r>
@@ -22052,7 +22633,40 @@
           <w:shd w:val="clear" w:color="auto" w:fill="FFFFFF"/>
           <w:lang w:val="ru-RU"/>
         </w:rPr>
-        <w:t>отражая общий уровень настроения клиентов </w:t>
+        <w:t>отражая общий уровень настроения клиентов</w:t>
+      </w:r>
+      <w:r>
+        <w:rPr>
+          <w:rFonts w:ascii="Times New Roman" w:hAnsi="Times New Roman"/>
+          <w:color w:val="0F1115"/>
+          <w:sz w:val="28"/>
+          <w:szCs w:val="28"/>
+          <w:shd w:val="clear" w:color="auto" w:fill="FFFFFF"/>
+          <w:lang w:val="ru-RU"/>
+        </w:rPr>
+        <w:t>[</w:t>
+      </w:r>
+      <w:r>
+        <w:rPr>
+          <w:rFonts w:ascii="Times New Roman" w:hAnsi="Times New Roman"/>
+          <w:color w:val="0F1115"/>
+          <w:sz w:val="28"/>
+          <w:szCs w:val="28"/>
+          <w:shd w:val="clear" w:color="auto" w:fill="FFFFFF"/>
+          <w:lang w:val="ru-RU"/>
+        </w:rPr>
+        <w:t>4</w:t>
+      </w:r>
+      <w:r>
+        <w:rPr>
+          <w:rFonts w:ascii="Times New Roman" w:hAnsi="Times New Roman"/>
+          <w:color w:val="0F1115"/>
+          <w:sz w:val="28"/>
+          <w:szCs w:val="28"/>
+          <w:shd w:val="clear" w:color="auto" w:fill="FFFFFF"/>
+          <w:lang w:val="ru-RU"/>
+        </w:rPr>
+        <w:t>]</w:t>
       </w:r>
       <w:r>
         <w:rPr>
@@ -23958,7 +24572,40 @@
           <w:shd w:val="clear" w:color="auto" w:fill="FFFFFF"/>
           <w:lang w:val="ru-RU"/>
         </w:rPr>
-        <w:t>обработки и анализа сведений об инцидентах </w:t>
+        <w:t>обработки и анализа сведений об инцидентах</w:t>
+      </w:r>
+      <w:r>
+        <w:rPr>
+          <w:rFonts w:ascii="Times New Roman" w:hAnsi="Times New Roman"/>
+          <w:color w:val="0F1115"/>
+          <w:sz w:val="28"/>
+          <w:szCs w:val="28"/>
+          <w:shd w:val="clear" w:color="auto" w:fill="FFFFFF"/>
+          <w:lang w:val="ru-RU"/>
+        </w:rPr>
+        <w:t>[</w:t>
+      </w:r>
+      <w:r>
+        <w:rPr>
+          <w:rFonts w:ascii="Times New Roman" w:hAnsi="Times New Roman"/>
+          <w:color w:val="0F1115"/>
+          <w:sz w:val="28"/>
+          <w:szCs w:val="28"/>
+          <w:shd w:val="clear" w:color="auto" w:fill="FFFFFF"/>
+          <w:lang w:val="ru-RU"/>
+        </w:rPr>
+        <w:t>5</w:t>
+      </w:r>
+      <w:r>
+        <w:rPr>
+          <w:rFonts w:ascii="Times New Roman" w:hAnsi="Times New Roman"/>
+          <w:color w:val="0F1115"/>
+          <w:sz w:val="28"/>
+          <w:szCs w:val="28"/>
+          <w:shd w:val="clear" w:color="auto" w:fill="FFFFFF"/>
+          <w:lang w:val="ru-RU"/>
+        </w:rPr>
+        <w:t>]</w:t>
       </w:r>
       <w:r>
         <w:rPr>
@@ -24122,6 +24769,39 @@
           <w:sz w:val="28"/>
           <w:szCs w:val="28"/>
           <w:shd w:val="clear" w:color="auto" w:fill="FFFFFF"/>
+          <w:lang w:val="ru-RU"/>
+        </w:rPr>
+        <w:t>[</w:t>
+      </w:r>
+      <w:r>
+        <w:rPr>
+          <w:rFonts w:ascii="Times New Roman" w:hAnsi="Times New Roman"/>
+          <w:color w:val="0F1115"/>
+          <w:sz w:val="28"/>
+          <w:szCs w:val="28"/>
+          <w:shd w:val="clear" w:color="auto" w:fill="FFFFFF"/>
+          <w:lang w:val="ru-RU"/>
+        </w:rPr>
+        <w:t>5</w:t>
+      </w:r>
+      <w:r>
+        <w:rPr>
+          <w:rFonts w:ascii="Times New Roman" w:hAnsi="Times New Roman"/>
+          <w:color w:val="0F1115"/>
+          <w:sz w:val="28"/>
+          <w:szCs w:val="28"/>
+          <w:shd w:val="clear" w:color="auto" w:fill="FFFFFF"/>
+          <w:lang w:val="ru-RU"/>
+        </w:rPr>
+        <w:t>]</w:t>
+      </w:r>
+      <w:r>
+        <w:rPr>
+          <w:rFonts w:ascii="Times New Roman" w:hAnsi="Times New Roman"/>
+          <w:color w:val="0F1115"/>
+          <w:sz w:val="28"/>
+          <w:szCs w:val="28"/>
+          <w:shd w:val="clear" w:color="auto" w:fill="FFFFFF"/>
         </w:rPr>
         <w:t>.</w:t>
       </w:r>
@@ -27723,6 +28403,39 @@
           <w:sz w:val="28"/>
           <w:szCs w:val="28"/>
           <w:shd w:val="clear" w:color="auto" w:fill="FFFFFF"/>
+          <w:lang w:val="ru-RU"/>
+        </w:rPr>
+        <w:t>[</w:t>
+      </w:r>
+      <w:r>
+        <w:rPr>
+          <w:rFonts w:ascii="Times New Roman" w:hAnsi="Times New Roman"/>
+          <w:color w:val="0F1115"/>
+          <w:sz w:val="28"/>
+          <w:szCs w:val="28"/>
+          <w:shd w:val="clear" w:color="auto" w:fill="FFFFFF"/>
+          <w:lang w:val="ru-RU"/>
+        </w:rPr>
+        <w:t>4</w:t>
+      </w:r>
+      <w:r>
+        <w:rPr>
+          <w:rFonts w:ascii="Times New Roman" w:hAnsi="Times New Roman"/>
+          <w:color w:val="0F1115"/>
+          <w:sz w:val="28"/>
+          <w:szCs w:val="28"/>
+          <w:shd w:val="clear" w:color="auto" w:fill="FFFFFF"/>
+          <w:lang w:val="ru-RU"/>
+        </w:rPr>
+        <w:t>]</w:t>
+      </w:r>
+      <w:r>
+        <w:rPr>
+          <w:rFonts w:ascii="Times New Roman" w:hAnsi="Times New Roman"/>
+          <w:color w:val="0F1115"/>
+          <w:sz w:val="28"/>
+          <w:szCs w:val="28"/>
+          <w:shd w:val="clear" w:color="auto" w:fill="FFFFFF"/>
         </w:rPr>
         <w:t>.</w:t>
       </w:r>
@@ -27920,6 +28633,39 @@
           <w:sz w:val="28"/>
           <w:szCs w:val="28"/>
           <w:shd w:val="clear" w:color="auto" w:fill="FFFFFF"/>
+          <w:lang w:val="ru-RU"/>
+        </w:rPr>
+        <w:t>[</w:t>
+      </w:r>
+      <w:r>
+        <w:rPr>
+          <w:rFonts w:ascii="Times New Roman" w:hAnsi="Times New Roman"/>
+          <w:color w:val="0F1115"/>
+          <w:sz w:val="28"/>
+          <w:szCs w:val="28"/>
+          <w:shd w:val="clear" w:color="auto" w:fill="FFFFFF"/>
+          <w:lang w:val="ru-RU"/>
+        </w:rPr>
+        <w:t>4</w:t>
+      </w:r>
+      <w:r>
+        <w:rPr>
+          <w:rFonts w:ascii="Times New Roman" w:hAnsi="Times New Roman"/>
+          <w:color w:val="0F1115"/>
+          <w:sz w:val="28"/>
+          <w:szCs w:val="28"/>
+          <w:shd w:val="clear" w:color="auto" w:fill="FFFFFF"/>
+          <w:lang w:val="ru-RU"/>
+        </w:rPr>
+        <w:t>]</w:t>
+      </w:r>
+      <w:r>
+        <w:rPr>
+          <w:rFonts w:ascii="Times New Roman" w:hAnsi="Times New Roman"/>
+          <w:color w:val="0F1115"/>
+          <w:sz w:val="28"/>
+          <w:szCs w:val="28"/>
+          <w:shd w:val="clear" w:color="auto" w:fill="FFFFFF"/>
         </w:rPr>
         <w:t>.</w:t>
       </w:r>
@@ -28149,6 +28895,39 @@
           <w:sz w:val="28"/>
           <w:szCs w:val="28"/>
           <w:shd w:val="clear" w:color="auto" w:fill="FFFFFF"/>
+          <w:lang w:val="ru-RU"/>
+        </w:rPr>
+        <w:t>[</w:t>
+      </w:r>
+      <w:r>
+        <w:rPr>
+          <w:rFonts w:ascii="Times New Roman" w:hAnsi="Times New Roman"/>
+          <w:color w:val="0F1115"/>
+          <w:sz w:val="28"/>
+          <w:szCs w:val="28"/>
+          <w:shd w:val="clear" w:color="auto" w:fill="FFFFFF"/>
+          <w:lang w:val="ru-RU"/>
+        </w:rPr>
+        <w:t>7</w:t>
+      </w:r>
+      <w:r>
+        <w:rPr>
+          <w:rFonts w:ascii="Times New Roman" w:hAnsi="Times New Roman"/>
+          <w:color w:val="0F1115"/>
+          <w:sz w:val="28"/>
+          <w:szCs w:val="28"/>
+          <w:shd w:val="clear" w:color="auto" w:fill="FFFFFF"/>
+          <w:lang w:val="ru-RU"/>
+        </w:rPr>
+        <w:t>]</w:t>
+      </w:r>
+      <w:r>
+        <w:rPr>
+          <w:rFonts w:ascii="Times New Roman" w:hAnsi="Times New Roman"/>
+          <w:color w:val="0F1115"/>
+          <w:sz w:val="28"/>
+          <w:szCs w:val="28"/>
+          <w:shd w:val="clear" w:color="auto" w:fill="FFFFFF"/>
         </w:rPr>
         <w:t>.</w:t>
       </w:r>
@@ -29129,6 +29908,39 @@
           <w:sz w:val="28"/>
           <w:szCs w:val="28"/>
           <w:shd w:val="clear" w:color="auto" w:fill="FFFFFF"/>
+          <w:lang w:val="ru-RU"/>
+        </w:rPr>
+        <w:t>[</w:t>
+      </w:r>
+      <w:r>
+        <w:rPr>
+          <w:rFonts w:ascii="Times New Roman" w:hAnsi="Times New Roman"/>
+          <w:color w:val="0F1115"/>
+          <w:sz w:val="28"/>
+          <w:szCs w:val="28"/>
+          <w:shd w:val="clear" w:color="auto" w:fill="FFFFFF"/>
+          <w:lang w:val="ru-RU"/>
+        </w:rPr>
+        <w:t>7</w:t>
+      </w:r>
+      <w:r>
+        <w:rPr>
+          <w:rFonts w:ascii="Times New Roman" w:hAnsi="Times New Roman"/>
+          <w:color w:val="0F1115"/>
+          <w:sz w:val="28"/>
+          <w:szCs w:val="28"/>
+          <w:shd w:val="clear" w:color="auto" w:fill="FFFFFF"/>
+          <w:lang w:val="ru-RU"/>
+        </w:rPr>
+        <w:t>]</w:t>
+      </w:r>
+      <w:r>
+        <w:rPr>
+          <w:rFonts w:ascii="Times New Roman" w:hAnsi="Times New Roman"/>
+          <w:color w:val="0F1115"/>
+          <w:sz w:val="28"/>
+          <w:szCs w:val="28"/>
+          <w:shd w:val="clear" w:color="auto" w:fill="FFFFFF"/>
         </w:rPr>
         <w:t>.</w:t>
       </w:r>
@@ -29404,7 +30216,52 @@
           <w:shd w:val="clear" w:color="auto" w:fill="FFFFFF"/>
           <w:lang w:val="ru-RU"/>
         </w:rPr>
-        <w:t>Контроль реализации ИТ-проектов осуществляется на всех этапах. Оцениваются соблюдение сроков, бюджетные ограничения, качество разработанных решений и соответствие функциональных возможностей требованиям заказчика. Особое внимание уделяется управлению рисками, включая технологические, операционные и информационные риски. Все изменения в рамках проекта проходят процедуру согласования и тестирования, что позволяет минимизировать негативное влияние на действующие бизнес-процессы и ИТ-инфраструктуру.</w:t>
+        <w:t>Контроль реализации ИТ-проектов осуществляется на всех этапах. Оцениваются соблюдение сроков, бюджетные ограничения, качество разработанных решений и соответствие функциональных возможностей требованиям заказчика. Особое внимание уделяется управлению рисками, включая технологические, операционные и информационные риски. Все изменения в рамках проекта проходят процедуру согласования и тестирования, что позволяет минимизировать негативное влияние на действующие бизнес-процессы и ИТ-инфраструктуру</w:t>
+      </w:r>
+      <w:r>
+        <w:rPr>
+          <w:rFonts w:ascii="Times New Roman" w:hAnsi="Times New Roman"/>
+          <w:color w:val="0F1115"/>
+          <w:sz w:val="28"/>
+          <w:szCs w:val="28"/>
+          <w:shd w:val="clear" w:color="auto" w:fill="FFFFFF"/>
+          <w:lang w:val="ru-RU"/>
+        </w:rPr>
+        <w:t>[</w:t>
+      </w:r>
+      <w:r>
+        <w:rPr>
+          <w:rFonts w:ascii="Times New Roman" w:hAnsi="Times New Roman"/>
+          <w:color w:val="0F1115"/>
+          <w:sz w:val="28"/>
+          <w:szCs w:val="28"/>
+          <w:shd w:val="clear" w:color="auto" w:fill="FFFFFF"/>
+          <w:lang w:val="ru-RU"/>
+        </w:rPr>
+        <w:t>13</w:t>
+      </w:r>
+      <w:r>
+        <w:rPr>
+          <w:rFonts w:ascii="Times New Roman" w:hAnsi="Times New Roman"/>
+          <w:color w:val="0F1115"/>
+          <w:sz w:val="28"/>
+          <w:szCs w:val="28"/>
+          <w:shd w:val="clear" w:color="auto" w:fill="FFFFFF"/>
+          <w:lang w:val="ru-RU"/>
+        </w:rPr>
+        <w:t>]</w:t>
+      </w:r>
+      <w:r>
+        <w:rPr>
+          <w:rStyle w:val="a3"/>
+          <w:rFonts w:ascii="Times New Roman" w:hAnsi="Times New Roman"/>
+          <w:color w:val="0F1115"/>
+          <w:sz w:val="28"/>
+          <w:szCs w:val="28"/>
+          <w:shd w:val="clear" w:color="auto" w:fill="FFFFFF"/>
+          <w:lang w:val="ru-RU"/>
+        </w:rPr>
+        <w:t>.</w:t>
       </w:r>
     </w:p>
     <w:p>
@@ -29572,7 +30429,52 @@
           <w:shd w:val="clear" w:color="auto" w:fill="FFFFFF"/>
           <w:lang w:val="ru-RU"/>
         </w:rPr>
-        <w:t>В процессе ИТ-аудита анализируются процессы разработки и сопровождения систем, управление доступом к данным, соответствие требованиям информационной безопасности, а также корректность функционирования ключевых банковских систем. Оценивается устойчивость ИТ-инфраструктуры, полнота документирования процессов и эффективность системы управления изменениями. По результатам аудита формируются рекомендации по устранению выявленных недостатков и повышению уровня зрелости ИТ-управления. Согласно официальной информации, Наблюдательный совет банка регулярно рассматривает управленческую отчетность по вопросам системы внутреннего аудита . Кроме того, при Наблюдательном совете функционирует Аудиторский комитет, который в первом полугодии 2025 года провел 13 заседаний .</w:t>
+        <w:t>В процессе ИТ-аудита анализируются процессы разработки и сопровождения систем, управление доступом к данным, соответствие требованиям информационной безопасности, а также корректность функционирования ключевых банковских систем. Оценивается устойчивость ИТ-инфраструктуры, полнота документирования процессов и эффективность системы управления изменениями. По результатам аудита формируются рекомендации по устранению выявленных недостатков и повышению уровня зрелости ИТ-управления. Согласно официальной информации, Наблюдательный совет банка регулярно рассматривает управленческую отчетность по вопросам системы внутреннего аудита . Кроме того, при Наблюдательном совете функционирует Аудиторский комитет, который в первом полугодии 2025 года провел 13 заседаний </w:t>
+      </w:r>
+      <w:r>
+        <w:rPr>
+          <w:rFonts w:ascii="Times New Roman" w:hAnsi="Times New Roman"/>
+          <w:color w:val="0F1115"/>
+          <w:sz w:val="28"/>
+          <w:szCs w:val="28"/>
+          <w:shd w:val="clear" w:color="auto" w:fill="FFFFFF"/>
+          <w:lang w:val="ru-RU"/>
+        </w:rPr>
+        <w:t>[1</w:t>
+      </w:r>
+      <w:r>
+        <w:rPr>
+          <w:rFonts w:ascii="Times New Roman" w:hAnsi="Times New Roman"/>
+          <w:color w:val="0F1115"/>
+          <w:sz w:val="28"/>
+          <w:szCs w:val="28"/>
+          <w:shd w:val="clear" w:color="auto" w:fill="FFFFFF"/>
+          <w:lang w:val="ru-RU"/>
+        </w:rPr>
+        <w:t>3</w:t>
+      </w:r>
+      <w:r>
+        <w:rPr>
+          <w:rFonts w:ascii="Times New Roman" w:hAnsi="Times New Roman"/>
+          <w:color w:val="0F1115"/>
+          <w:sz w:val="28"/>
+          <w:szCs w:val="28"/>
+          <w:shd w:val="clear" w:color="auto" w:fill="FFFFFF"/>
+          <w:lang w:val="ru-RU"/>
+        </w:rPr>
+        <w:t>]</w:t>
+      </w:r>
+      <w:r>
+        <w:rPr>
+          <w:rStyle w:val="a3"/>
+          <w:rFonts w:ascii="Times New Roman" w:hAnsi="Times New Roman"/>
+          <w:color w:val="0F1115"/>
+          <w:sz w:val="28"/>
+          <w:szCs w:val="28"/>
+          <w:shd w:val="clear" w:color="auto" w:fill="FFFFFF"/>
+          <w:lang w:val="ru-RU"/>
+        </w:rPr>
+        <w:t>.</w:t>
       </w:r>
     </w:p>
     <w:p>
@@ -29713,14 +30615,8 @@
           <w:b w:val="0"/>
           <w:bCs w:val="0"/>
         </w:rPr>
-        <w:lastRenderedPageBreak/>
         <w:br w:type="page"/>
       </w:r>
-    </w:p>
-    <w:p>
-      <w:pPr>
-        <w:pStyle w:val="Heading1"/>
-      </w:pPr>
       <w:bookmarkStart w:id="11" w:name="_Toc11"/>
       <w:r>
         <w:rPr>
@@ -29761,6 +30657,35 @@
           <w:lang w:val="ru-BY"/>
         </w:rPr>
         <w:t>Для того чтобы определить, как и за счёт чего будет происходить повышение эффективности используемых информационных технологий и систем, необходимо определиться со стратегическими целями банка в общем с акцентом на целях по развитию цифровых каналов обслуживания, повышению качества клиентского сервиса, а также развитию ИТ и связанных с ним процессов.</w:t>
+      </w:r>
+      <w:r>
+        <w:rPr>
+          <w:color w:val="0F1115"/>
+          <w:shd w:val="clear" w:color="auto" w:fill="FFFFFF"/>
+        </w:rPr>
+        <w:t xml:space="preserve"> </w:t>
+      </w:r>
+      <w:r>
+        <w:rPr>
+          <w:color w:val="0F1115"/>
+          <w:shd w:val="clear" w:color="auto" w:fill="FFFFFF"/>
+        </w:rPr>
+        <w:t>[</w:t>
+      </w:r>
+      <w:r>
+        <w:rPr>
+          <w:color w:val="0F1115"/>
+          <w:shd w:val="clear" w:color="auto" w:fill="FFFFFF"/>
+          <w:lang w:val="en-US"/>
+        </w:rPr>
+        <w:t>6</w:t>
+      </w:r>
+      <w:r>
+        <w:rPr>
+          <w:color w:val="0F1115"/>
+          <w:shd w:val="clear" w:color="auto" w:fill="FFFFFF"/>
+        </w:rPr>
+        <w:t>]</w:t>
       </w:r>
     </w:p>
     <w:p>
@@ -29955,14 +30880,14 @@
         <w:rPr>
           <w:lang w:val="ru-BY"/>
         </w:rPr>
-        <w:t xml:space="preserve"> Стратегия банка направлена на расширение каналов взаимодействия с клиентами, включая интеграцию </w:t>
+        <w:t xml:space="preserve"> Стратегия банка направлена на расширение каналов взаимодействия с клиентами, включая интеграцию с популярными мессенджерами. Telegram как один из наиболее </w:t>
       </w:r>
       <w:r>
         <w:rPr>
           <w:lang w:val="ru-BY"/>
         </w:rPr>
         <w:lastRenderedPageBreak/>
-        <w:t>с популярными мессенджерами. Telegram как один из наиболее востребованных каналов коммуникации в Республике Беларусь является перспективной платформой для предоставления банковских услуг. Разработка веб-интерфейса в мессенджере Telegram позволяет обеспечить бесшовный клиентский опыт и повысить доступность банковских сервисов.</w:t>
+        <w:t>востребованных каналов коммуникации в Республике Беларусь является перспективной платформой для предоставления банковских услуг. Разработка веб-интерфейса в мессенджере Telegram позволяет обеспечить бесшовный клиентский опыт и повысить доступность банковских сервисов.</w:t>
       </w:r>
     </w:p>
     <w:p>
@@ -30000,7 +30925,34 @@
         <w:rPr>
           <w:lang w:val="ru-BY"/>
         </w:rPr>
-        <w:t>Ключевой целью в блоке управления рисками для банка является дальнейшее развитие и совершенствование системы управления рисками, направленной на сохранение сбалансированности риска и доходности, обеспечивающей финансовую надежность. Для разрабатываемой рекомендательной системы данное направление также актуально: система должна учитывать риск-профиль клиента при формировании рекомендаций, предлагая только те продукты, которые соответствуют его кредитоспособности и не создают избыточных рисков для банка.</w:t>
+        <w:t>Ключевой целью в блоке управления рисками для банка является дальнейшее развитие и совершенствование системы управления рисками, направленной на сохранение сбалансированности риска и доходности, обеспечивающей финансовую надежность. Для разрабатываемой рекомендательной системы данное направление также актуально: система должна учитывать риск-профиль клиента при формировании рекомендаций, предлагая только те продукты, которые соответствуют его кредитоспособности и не создают избыточных рисков для банка</w:t>
+      </w:r>
+      <w:r>
+        <w:rPr>
+          <w:color w:val="0F1115"/>
+          <w:shd w:val="clear" w:color="auto" w:fill="FFFFFF"/>
+        </w:rPr>
+        <w:t>[</w:t>
+      </w:r>
+      <w:r>
+        <w:rPr>
+          <w:color w:val="0F1115"/>
+          <w:shd w:val="clear" w:color="auto" w:fill="FFFFFF"/>
+        </w:rPr>
+        <w:t>6</w:t>
+      </w:r>
+      <w:r>
+        <w:rPr>
+          <w:color w:val="0F1115"/>
+          <w:shd w:val="clear" w:color="auto" w:fill="FFFFFF"/>
+        </w:rPr>
+        <w:t>]</w:t>
+      </w:r>
+      <w:r>
+        <w:rPr>
+          <w:lang w:val="ru-BY"/>
+        </w:rPr>
+        <w:t>.</w:t>
       </w:r>
     </w:p>
     <w:p>
@@ -30047,27 +30999,54 @@
         <w:rPr>
           <w:lang w:val="ru-BY"/>
         </w:rPr>
-        <w:t> BSC-диаграммы отражает стратегические цели ОАО «АСБ Беларусбанк», направленные на обеспечение устойчивого роста финансовых результатов и повышение операционной эффективности. Достижение данных целей имеет ключевое значение для поддержания финансовой устойчивости банка и эффективности использования капитала.</w:t>
-      </w:r>
-    </w:p>
-    <w:p>
-      <w:pPr>
+        <w:t> BSC-диаграммы отражает стратегические цели ОАО «АСБ Беларусбанк», направленные на обеспечение устойчивого роста финансовых результатов и повышение операционной эффективности. Достижение данных целей имеет ключевое значение для поддержания финансовой устойчивости банка и эффективности использования капитала</w:t>
+      </w:r>
+      <w:r>
+        <w:rPr>
+          <w:color w:val="0F1115"/>
+          <w:shd w:val="clear" w:color="auto" w:fill="FFFFFF"/>
+        </w:rPr>
+        <w:t>[</w:t>
+      </w:r>
+      <w:r>
+        <w:rPr>
+          <w:color w:val="0F1115"/>
+          <w:shd w:val="clear" w:color="auto" w:fill="FFFFFF"/>
+        </w:rPr>
+        <w:t>6</w:t>
+      </w:r>
+      <w:r>
+        <w:rPr>
+          <w:color w:val="0F1115"/>
+          <w:shd w:val="clear" w:color="auto" w:fill="FFFFFF"/>
+        </w:rPr>
+        <w:t>]</w:t>
+      </w:r>
+      <w:r>
         <w:rPr>
           <w:lang w:val="ru-BY"/>
         </w:rPr>
-      </w:pPr>
-      <w:r>
+        <w:t>.</w:t>
+      </w:r>
+    </w:p>
+    <w:p>
+      <w:pPr>
         <w:rPr>
           <w:lang w:val="ru-BY"/>
         </w:rPr>
-        <w:t xml:space="preserve">В рамках данной перспективы особое внимание уделяется росту кросс-продаж банковских продуктов за счёт внедрения интеллектуальных систем персонализированных рекомендаций. Использование рекомендательной системы в Telegram позволяет увеличить объём продаж целевых продуктов, снизить стоимость привлечения клиентов и сократить долю ручных операций при подборе и оформлении банковских услуг. Дополнительно финансовая </w:t>
-      </w:r>
+      </w:pPr>
       <w:r>
         <w:rPr>
           <w:lang w:val="ru-BY"/>
         </w:rPr>
+        <w:t xml:space="preserve">В рамках данной перспективы особое внимание уделяется росту кросс-продаж банковских продуктов за счёт внедрения интеллектуальных систем персонализированных рекомендаций. Использование рекомендательной системы в Telegram позволяет увеличить объём продаж целевых продуктов, снизить стоимость привлечения клиентов и сократить долю ручных операций при подборе и оформлении банковских услуг. Дополнительно финансовая перспектива ориентирована на повышение операционной эффективности за счёт </w:t>
+      </w:r>
+      <w:r>
+        <w:rPr>
+          <w:lang w:val="ru-BY"/>
+        </w:rPr>
         <w:lastRenderedPageBreak/>
-        <w:t>перспектива ориентирована на повышение операционной эффективности за счёт автоматизации взаимодействия с клиентами и сокращения нагрузки на сотрудников Контакт-центра. Реализация указанных инициатив способствует снижению удельных затрат на обслуживание, росту чистой прибыли и повышению рентабельности капитала, что напрямую соответствует стратегическим целям развития банка.</w:t>
+        <w:t>автоматизации взаимодействия с клиентами и сокращения нагрузки на сотрудников Контакт-центра. Реализация указанных инициатив способствует снижению удельных затрат на обслуживание, росту чистой прибыли и повышению рентабельности капитала, что напрямую соответствует стратегическим целям развития банка.</w:t>
       </w:r>
     </w:p>
     <w:p>
@@ -30244,14 +31223,14 @@
         <w:rPr>
           <w:lang w:val="ru-BY"/>
         </w:rPr>
-        <w:t xml:space="preserve">Рост клиентской базы обеспечивается за счёт расширения каналов взаимодействия с клиентами. Интеграция с Telegram как популярным мессенджером позволяет привлечь новую аудиторию и повысить частоту взаимодействия с существующими клиентами. Персонализированные рекомендации, основанные на анализе поведения и потребностей клиента, способствуют укреплению лояльности и формированию позитивного восприятия банка. Повышение лояльности и удовлетворённости клиентов достигается за счёт удобства использования сервиса, релевантности предлагаемых продуктов и оперативности получения необходимой информации. </w:t>
+        <w:t xml:space="preserve">Рост клиентской базы обеспечивается за счёт расширения каналов взаимодействия с клиентами. Интеграция с Telegram как популярным мессенджером позволяет привлечь новую аудиторию и повысить частоту взаимодействия с существующими клиентами. Персонализированные рекомендации, основанные на анализе поведения и потребностей клиента, способствуют укреплению лояльности и формированию позитивного восприятия банка. Повышение лояльности и удовлетворённости клиентов достигается за счёт удобства использования сервиса, релевантности предлагаемых продуктов и оперативности получения необходимой информации. Рекомендательная система в Telegram сокращает время поиска подходящего </w:t>
       </w:r>
       <w:r>
         <w:rPr>
           <w:lang w:val="ru-BY"/>
         </w:rPr>
         <w:lastRenderedPageBreak/>
-        <w:t>Рекомендательная система в Telegram сокращает время поиска подходящего банковского продукта, предоставляя клиенту персонализированные предложения в привычном интерфейсе мессенджера.</w:t>
+        <w:t>банковского продукта, предоставляя клиенту персонализированные предложения в привычном интерфейсе мессенджера.</w:t>
       </w:r>
     </w:p>
     <w:p>
@@ -31615,7 +32594,34 @@
         <w:rPr>
           <w:lang w:val="ru-BY"/>
         </w:rPr>
-        <w:t>В настоящее время процесс предоставления банковских услуг клиенту характеризуется высокой долей ручного труда и активного участия самого клиента в поиске и выборе продукта. Типовой сценарий взаимодействия включает следующие этапы: клиент самостоятельно заходит на официальный сайт банка или в мобильное приложение, изучает информацию о продуктах и услугах, сравнивает условия, просматривает тарифы, после чего принимает решение о необходимости обращения в отделение банка или совершения операции через дистанционные каналы, а затем обращается в Контакт-центр для получения дополнительной консультации либо посещает отделение банка, где сотрудник осуществляет подбор продукта на основе предоставленной клиентом информации.</w:t>
+        <w:t>В настоящее время процесс предоставления банковских услуг клиенту характеризуется высокой долей ручного труда и активного участия самого клиента в поиске и выборе продукта. Типовой сценарий взаимодействия включает следующие этапы: клиент самостоятельно заходит на официальный сайт банка или в мобильное приложение, изучает информацию о продуктах и услугах, сравнивает условия, просматривает тарифы, после чего принимает решение о необходимости обращения в отделение банка или совершения операции через дистанционные каналы, а затем обращается в Контакт-центр для получения дополнительной консультации либо посещает отделение банка, где сотрудник осуществляет подбор продукта на основе предоставленной клиентом информации</w:t>
+      </w:r>
+      <w:r>
+        <w:rPr>
+          <w:color w:val="0F1115"/>
+          <w:shd w:val="clear" w:color="auto" w:fill="FFFFFF"/>
+        </w:rPr>
+        <w:t>[</w:t>
+      </w:r>
+      <w:r>
+        <w:rPr>
+          <w:color w:val="0F1115"/>
+          <w:shd w:val="clear" w:color="auto" w:fill="FFFFFF"/>
+        </w:rPr>
+        <w:t>5</w:t>
+      </w:r>
+      <w:r>
+        <w:rPr>
+          <w:color w:val="0F1115"/>
+          <w:shd w:val="clear" w:color="auto" w:fill="FFFFFF"/>
+        </w:rPr>
+        <w:t>]</w:t>
+      </w:r>
+      <w:r>
+        <w:rPr>
+          <w:lang w:val="ru-BY"/>
+        </w:rPr>
+        <w:t>.</w:t>
       </w:r>
     </w:p>
     <w:p>
@@ -31654,7 +32660,34 @@
         <w:rPr>
           <w:lang w:val="ru-BY"/>
         </w:rPr>
-        <w:t> выражается в том, что подбор продуктов осуществляется либо самостоятельно клиентом без учёта его индивидуальных потребностей и финансового профиля, либо сотрудником банка на основе ограниченной информации, предоставленной клиентом, а отсутствие автоматизированных механизмов анализа потребностей и формирования персонализированных рекомендаций снижает эффективность кросс-продаж. Высокая нагрузка на сотрудников Контакт-центра возникает из-за значительного объёма типовых запросов (информация о продуктах, тарифах, условиях), что отвлекает квалифицированных сотрудников от решения более сложных и нестандартных задач, требующих экспертной оценки.</w:t>
+        <w:t> выражается в том, что подбор продуктов осуществляется либо самостоятельно клиентом без учёта его индивидуальных потребностей и финансового профиля, либо сотрудником банка на основе ограниченной информации, предоставленной клиентом, а отсутствие автоматизированных механизмов анализа потребностей и формирования персонализированных рекомендаций снижает эффективность кросс-продаж. Высокая нагрузка на сотрудников Контакт-центра возникает из-за значительного объёма типовых запросов (информация о продуктах, тарифах, условиях), что отвлекает квалифицированных сотрудников от решения более сложных и нестандартных задач, требующих экспертной оценки</w:t>
+      </w:r>
+      <w:r>
+        <w:rPr>
+          <w:color w:val="0F1115"/>
+          <w:shd w:val="clear" w:color="auto" w:fill="FFFFFF"/>
+        </w:rPr>
+        <w:t>[</w:t>
+      </w:r>
+      <w:r>
+        <w:rPr>
+          <w:color w:val="0F1115"/>
+          <w:shd w:val="clear" w:color="auto" w:fill="FFFFFF"/>
+        </w:rPr>
+        <w:t>5</w:t>
+      </w:r>
+      <w:r>
+        <w:rPr>
+          <w:color w:val="0F1115"/>
+          <w:shd w:val="clear" w:color="auto" w:fill="FFFFFF"/>
+        </w:rPr>
+        <w:t>]</w:t>
+      </w:r>
+      <w:r>
+        <w:rPr>
+          <w:lang w:val="ru-BY"/>
+        </w:rPr>
+        <w:t>.</w:t>
       </w:r>
     </w:p>
     <w:p>
@@ -31694,7 +32727,34 @@
         <w:rPr>
           <w:lang w:val="ru-BY"/>
         </w:rPr>
-        <w:t>Выбор рекомендательной системы обусловлен необходимостью автоматизации процесса подбора банковских продуктов и персонализации предложений. Рекомендательная система на основе алгоритмов машинного обучения позволяет анализировать поведение клиента, его транзакционную активность, финансовый профиль и жизненные события, формировать персонализированные предложения банковских продуктов, наиболее релевантных текущим потребностям клиента, сокращать время принятия решения клиентом за счёт предоставления готовых, адаптированных под него вариантов, а также повышать эффективность кросс-продаж за счёт проактивного предложения сопутствующих продуктов и услуг.</w:t>
+        <w:t>Выбор рекомендательной системы обусловлен необходимостью автоматизации процесса подбора банковских продуктов и персонализации предложений. Рекомендательная система на основе алгоритмов машинного обучения позволяет анализировать поведение клиента, его транзакционную активность, финансовый профиль и жизненные события, формировать персонализированные предложения банковских продуктов, наиболее релевантных текущим потребностям клиента, сокращать время принятия решения клиентом за счёт предоставления готовых, адаптированных под него вариантов, а также повышать эффективность кросс-продаж за счёт проактивного предложения сопутствующих продуктов и услуг</w:t>
+      </w:r>
+      <w:r>
+        <w:rPr>
+          <w:color w:val="0F1115"/>
+          <w:shd w:val="clear" w:color="auto" w:fill="FFFFFF"/>
+        </w:rPr>
+        <w:t>[</w:t>
+      </w:r>
+      <w:r>
+        <w:rPr>
+          <w:color w:val="0F1115"/>
+          <w:shd w:val="clear" w:color="auto" w:fill="FFFFFF"/>
+        </w:rPr>
+        <w:t>8</w:t>
+      </w:r>
+      <w:r>
+        <w:rPr>
+          <w:color w:val="0F1115"/>
+          <w:shd w:val="clear" w:color="auto" w:fill="FFFFFF"/>
+        </w:rPr>
+        <w:t>]</w:t>
+      </w:r>
+      <w:r>
+        <w:rPr>
+          <w:lang w:val="ru-BY"/>
+        </w:rPr>
+        <w:t>.</w:t>
       </w:r>
     </w:p>
     <w:p>
@@ -31766,19 +32826,46 @@
         <w:rPr>
           <w:lang w:val="ru-BY"/>
         </w:rPr>
-        <w:t>Сокращение времени получения банковской услуги. Является ключевым фактором оптимизации клиентского опыта. В новом бизнес-процессе клиенту не требуется заходить на сайт, изучать условия, звонить в Контакт-центр и посещать отделение. Все этапы взаимодействия, включая первичную консультацию, подбор продукта и частичное оформление, реализуются непосредственно в Telegram-боте. Ожидаемое сокращение времени от возникновения потребности до получения предложения составляет с нескольких дней до нескольких минут, что способствует снижению отказов клиентов и повышению лояльности к банку.</w:t>
-      </w:r>
-    </w:p>
-    <w:p>
-      <w:pPr>
+        <w:t>Сокращение времени получения банковской услуги. Является ключевым фактором оптимизации клиентского опыта. В новом бизнес-процессе клиенту не требуется заходить на сайт, изучать условия, звонить в Контакт-центр и посещать отделение. Все этапы взаимодействия, включая первичную консультацию, подбор продукта и частичное оформление, реализуются непосредственно в Telegram-боте. Ожидаемое сокращение времени от возникновения потребности до получения предложения составляет с нескольких дней до нескольких минут, что способствует снижению отказов клиентов и повышению лояльности к банку</w:t>
+      </w:r>
+      <w:r>
+        <w:rPr>
+          <w:color w:val="0F1115"/>
+          <w:shd w:val="clear" w:color="auto" w:fill="FFFFFF"/>
+        </w:rPr>
+        <w:t>[</w:t>
+      </w:r>
+      <w:r>
+        <w:rPr>
+          <w:color w:val="0F1115"/>
+          <w:shd w:val="clear" w:color="auto" w:fill="FFFFFF"/>
+        </w:rPr>
+        <w:t>8</w:t>
+      </w:r>
+      <w:r>
+        <w:rPr>
+          <w:color w:val="0F1115"/>
+          <w:shd w:val="clear" w:color="auto" w:fill="FFFFFF"/>
+        </w:rPr>
+        <w:t>]</w:t>
+      </w:r>
+      <w:r>
         <w:rPr>
           <w:lang w:val="ru-BY"/>
         </w:rPr>
-      </w:pPr>
-      <w:r>
+        <w:t>.</w:t>
+      </w:r>
+    </w:p>
+    <w:p>
+      <w:pPr>
         <w:rPr>
           <w:lang w:val="ru-BY"/>
         </w:rPr>
+      </w:pPr>
+      <w:r>
+        <w:rPr>
+          <w:lang w:val="ru-BY"/>
+        </w:rPr>
         <w:t>Централизация и стандартизация данных о клиентах и продуктах. Для обеспечения корректной работы рекомендательной системы будет разработана архитектура интеграции с существующими ИТ-системами банка, включая CRM, корпоративное хранилище данных и системы дистанционного банковского обслуживания. Это позволит сформировать единый профиль клиента, содержащий информацию о его финансовом поведении, предпочтениях и текущих потребностях, а также обеспечить актуальность и достоверность информации о продуктах и условиях их предоставления.</w:t>
       </w:r>
     </w:p>
@@ -31825,19 +32912,46 @@
           <w:lang w:val="ru-BY"/>
         </w:rPr>
         <w:lastRenderedPageBreak/>
-        <w:t>коммуникации. Новый бизнес-процесс может быть представлен следующим образом: клиент, имеющий установленный Telegram, получает персонализированное предложение банковского продукта; система на основе анализа профиля клиента формирует рекомендацию и направляет её в виде интерактивного сообщения; клиент может ознакомиться с условиями, задать уточняющие вопросы боту, получить дополнительную информацию и частично оформить продукт без необходимости посещения отделения или звонка в Контакт-центр; при необходимости подключения эксперта система автоматически передаёт обращение соответствующему сотруднику с полным контекстом взаимодействия.</w:t>
-      </w:r>
-    </w:p>
-    <w:p>
-      <w:pPr>
+        <w:t>коммуникации. Новый бизнес-процесс может быть представлен следующим образом: клиент, имеющий установленный Telegram, получает персонализированное предложение банковского продукта; система на основе анализа профиля клиента формирует рекомендацию и направляет её в виде интерактивного сообщения; клиент может ознакомиться с условиями, задать уточняющие вопросы боту, получить дополнительную информацию и частично оформить продукт без необходимости посещения отделения или звонка в Контакт-центр; при необходимости подключения эксперта система автоматически передаёт обращение соответствующему сотруднику с полным контекстом взаимодействия</w:t>
+      </w:r>
+      <w:r>
+        <w:rPr>
+          <w:color w:val="0F1115"/>
+          <w:shd w:val="clear" w:color="auto" w:fill="FFFFFF"/>
+        </w:rPr>
+        <w:t>[</w:t>
+      </w:r>
+      <w:r>
+        <w:rPr>
+          <w:color w:val="0F1115"/>
+          <w:shd w:val="clear" w:color="auto" w:fill="FFFFFF"/>
+        </w:rPr>
+        <w:t>8</w:t>
+      </w:r>
+      <w:r>
+        <w:rPr>
+          <w:color w:val="0F1115"/>
+          <w:shd w:val="clear" w:color="auto" w:fill="FFFFFF"/>
+        </w:rPr>
+        <w:t>]</w:t>
+      </w:r>
+      <w:r>
         <w:rPr>
           <w:lang w:val="ru-BY"/>
         </w:rPr>
-      </w:pPr>
-      <w:r>
+        <w:t>.</w:t>
+      </w:r>
+    </w:p>
+    <w:p>
+      <w:pPr>
         <w:rPr>
           <w:lang w:val="ru-BY"/>
         </w:rPr>
+      </w:pPr>
+      <w:r>
+        <w:rPr>
+          <w:lang w:val="ru-BY"/>
+        </w:rPr>
         <w:t>Реализация предложенных направлений совершенствования ИТ-архитектуры создаёт основу для дальнейшего развития автоматизированных методов взаимодействия с клиентами, повышения эффективности работы Контакт-центра и достижения стратегических целей ОАО «АСБ Беларусбанк» в области цифрового развития и клиентского сервиса.</w:t>
       </w:r>
     </w:p>
@@ -31864,70 +32978,54 @@
         <w:rPr>
           <w:lang w:val="ru-BY"/>
         </w:rPr>
-        <w:t>Таким образом, переход от аналитической части к проектной реализуется на основе логической преемственности, обеспечивая практическую направленность и целостность исследования. В третьем разделе практики рассмотрены вопросы повышения эффективности информационных технологий и систем ОАО «АСБ Беларусбанк» в контексте их соответствия бизнес-целям организации. Проанализированы подходы к стратегическому планированию развития ИТ и показана их взаимосвязь с задачами совершенствования процесса предоставления банковских услуг через цифровые каналы, а также обоснована роль ИТ-стратегии как инструмента поддержки ключевых бизнес-процессов банка.</w:t>
-      </w:r>
-    </w:p>
-    <w:p>
-      <w:pPr>
+        <w:t>Таким образом, переход от аналитической части к проектной реализуется на основе логической преемственности, обеспечивая практическую направленность и целостность исследования. В третьем разделе практики рассмотрены вопросы повышения эффективности информационных технологий и систем ОАО «АСБ Беларусбанк» в контексте их соответствия бизнес-целям организации. Проанализированы подходы к стратегическому планированию развития ИТ и показана их взаимосвязь с задачами совершенствования процесса предоставления банковских услуг через цифровые каналы, а также обоснована роль ИТ-стратегии как инструмента поддержки ключевых бизнес-процессов банка</w:t>
+      </w:r>
+      <w:r>
+        <w:rPr>
+          <w:color w:val="0F1115"/>
+          <w:shd w:val="clear" w:color="auto" w:fill="FFFFFF"/>
+        </w:rPr>
+        <w:t>[</w:t>
+      </w:r>
+      <w:r>
+        <w:rPr>
+          <w:color w:val="0F1115"/>
+          <w:shd w:val="clear" w:color="auto" w:fill="FFFFFF"/>
+        </w:rPr>
+        <w:t>8</w:t>
+      </w:r>
+      <w:r>
+        <w:rPr>
+          <w:color w:val="0F1115"/>
+          <w:shd w:val="clear" w:color="auto" w:fill="FFFFFF"/>
+        </w:rPr>
+        <w:t>]</w:t>
+      </w:r>
+      <w:r>
         <w:rPr>
           <w:lang w:val="ru-BY"/>
         </w:rPr>
-      </w:pPr>
-      <w:r>
+        <w:t>.</w:t>
+      </w:r>
+    </w:p>
+    <w:p>
+      <w:pPr>
         <w:rPr>
           <w:lang w:val="ru-BY"/>
         </w:rPr>
+      </w:pPr>
+      <w:r>
+        <w:rPr>
+          <w:lang w:val="ru-BY"/>
+        </w:rPr>
         <w:t>В ходе анализа сформированы предложения по развитию ИТ-архитектуры, направленные на снижение доли ручных операций, повышение прозрачности и управляемости процесса предоставления услуг, а также уменьшение операционных рисков за счёт автоматизации и интеграции информационных систем. Полученные результаты подтверждают необходимость дальнейшего развития ИТ-решений как основы для повышения эффективности цифрового обслуживания клиентов и практической реализации мероприятий по совершенствованию бизнес-процессов банка.</w:t>
       </w:r>
     </w:p>
     <w:p>
-      <w:r>
-        <w:rPr>
-          <w:rStyle w:val="a3"/>
-        </w:rPr>
-        <w:lastRenderedPageBreak/>
-        <w:br/>
-      </w:r>
-    </w:p>
-    <w:p>
       <w:pPr>
         <w:pStyle w:val="Heading1"/>
       </w:pPr>
       <w:bookmarkStart w:id="14" w:name="_Toc224589713"/>
-    </w:p>
-    <w:p>
-      <w:pPr>
-        <w:ind w:firstLine="0"/>
-        <w:jc w:val="left"/>
-        <w:rPr>
-          <w:rFonts w:eastAsia="Times New Roman" w:cs="Times New Roman"/>
-          <w:b/>
-          <w:bCs/>
-          <w:sz w:val="32"/>
-          <w:szCs w:val="32"/>
-        </w:rPr>
-      </w:pPr>
-    </w:p>
-    <w:p>
-      <w:pPr>
-        <w:ind w:firstLine="0"/>
-        <w:jc w:val="left"/>
-        <w:rPr>
-          <w:rFonts w:eastAsia="Times New Roman" w:cs="Times New Roman"/>
-          <w:b/>
-          <w:bCs/>
-          <w:sz w:val="32"/>
-          <w:szCs w:val="32"/>
-        </w:rPr>
-      </w:pPr>
-      <w:r>
-        <w:br w:type="page"/>
-      </w:r>
-    </w:p>
-    <w:p>
-      <w:pPr>
-        <w:pStyle w:val="Heading1"/>
-      </w:pPr>
       <w:r>
         <w:lastRenderedPageBreak/>
         <w:t>4. Отчёт о выполнении индивидуального задания</w:t>
@@ -33814,9 +34912,301 @@
       </w:r>
       <w:bookmarkEnd w:id="19"/>
     </w:p>
-    <w:p/>
+    <w:p>
+      <w:pPr>
+        <w:pStyle w:val="ListParagraph"/>
+        <w:numPr>
+          <w:ilvl w:val="0"/>
+          <w:numId w:val="11"/>
+        </w:numPr>
+        <w:ind w:left="0" w:firstLine="709"/>
+        <w:rPr>
+          <w:lang w:val="ru-BY"/>
+        </w:rPr>
+      </w:pPr>
+      <w:r>
+        <w:rPr>
+          <w:lang w:val="ru-BY"/>
+        </w:rPr>
+        <w:t xml:space="preserve"> Официальный сайт ОАО «АСБ Беларусбанк». – Режим доступа: </w:t>
+      </w:r>
+      <w:hyperlink r:id="rId21" w:tgtFrame="_new" w:history="1">
+        <w:r>
+          <w:rPr>
+            <w:rStyle w:val="Hyperlink"/>
+            <w:lang w:val="ru-BY"/>
+          </w:rPr>
+          <w:t>https://belarusbank.by</w:t>
+        </w:r>
+      </w:hyperlink>
+      <w:r>
+        <w:rPr>
+          <w:lang w:val="ru-BY"/>
+        </w:rPr>
+        <w:t xml:space="preserve"> </w:t>
+      </w:r>
+    </w:p>
+    <w:p>
+      <w:pPr>
+        <w:pStyle w:val="ListParagraph"/>
+        <w:numPr>
+          <w:ilvl w:val="0"/>
+          <w:numId w:val="11"/>
+        </w:numPr>
+        <w:ind w:left="0" w:firstLine="709"/>
+        <w:rPr>
+          <w:lang w:val="ru-BY"/>
+        </w:rPr>
+      </w:pPr>
+      <w:r>
+        <w:rPr>
+          <w:lang w:val="ru-BY"/>
+        </w:rPr>
+        <w:t xml:space="preserve">Годовая отчетность ОАО «АСБ Беларусбанк» за 2024–2025 гг. – Минск, 2025. </w:t>
+      </w:r>
+    </w:p>
+    <w:p>
+      <w:pPr>
+        <w:pStyle w:val="ListParagraph"/>
+        <w:numPr>
+          <w:ilvl w:val="0"/>
+          <w:numId w:val="11"/>
+        </w:numPr>
+        <w:ind w:left="0" w:firstLine="709"/>
+        <w:rPr>
+          <w:lang w:val="ru-BY"/>
+        </w:rPr>
+      </w:pPr>
+      <w:r>
+        <w:rPr>
+          <w:lang w:val="ru-BY"/>
+        </w:rPr>
+        <w:t xml:space="preserve">Национальный банк Республики Беларусь. Официальный сайт. – Режим доступа: </w:t>
+      </w:r>
+      <w:hyperlink r:id="rId22" w:tgtFrame="_new" w:history="1">
+        <w:r>
+          <w:rPr>
+            <w:rStyle w:val="Hyperlink"/>
+            <w:lang w:val="ru-BY"/>
+          </w:rPr>
+          <w:t>https://www.nbrb.by</w:t>
+        </w:r>
+      </w:hyperlink>
+      <w:r>
+        <w:rPr>
+          <w:lang w:val="ru-BY"/>
+        </w:rPr>
+        <w:t xml:space="preserve"> </w:t>
+      </w:r>
+    </w:p>
+    <w:p>
+      <w:pPr>
+        <w:pStyle w:val="ListParagraph"/>
+        <w:numPr>
+          <w:ilvl w:val="0"/>
+          <w:numId w:val="11"/>
+        </w:numPr>
+        <w:ind w:left="0" w:firstLine="709"/>
+        <w:rPr>
+          <w:lang w:val="ru-BY"/>
+        </w:rPr>
+      </w:pPr>
+      <w:r>
+        <w:rPr>
+          <w:lang w:val="ru-BY"/>
+        </w:rPr>
+        <w:t xml:space="preserve">Закон Республики Беларусь «О банках и банковской деятельности». – Минск, 2024. </w:t>
+      </w:r>
+    </w:p>
+    <w:p>
+      <w:pPr>
+        <w:pStyle w:val="ListParagraph"/>
+        <w:numPr>
+          <w:ilvl w:val="0"/>
+          <w:numId w:val="11"/>
+        </w:numPr>
+        <w:ind w:left="0" w:firstLine="709"/>
+        <w:rPr>
+          <w:lang w:val="ru-BY"/>
+        </w:rPr>
+      </w:pPr>
+      <w:r>
+        <w:rPr>
+          <w:lang w:val="ru-BY"/>
+        </w:rPr>
+        <w:t xml:space="preserve"> Куликов Г.Г. Управление информационными технологиями. – М.: КНОРУС, 2021. </w:t>
+      </w:r>
+    </w:p>
+    <w:p>
+      <w:pPr>
+        <w:pStyle w:val="ListParagraph"/>
+        <w:numPr>
+          <w:ilvl w:val="0"/>
+          <w:numId w:val="11"/>
+        </w:numPr>
+        <w:ind w:left="0" w:firstLine="709"/>
+        <w:rPr>
+          <w:lang w:val="ru-BY"/>
+        </w:rPr>
+      </w:pPr>
+      <w:r>
+        <w:rPr>
+          <w:lang w:val="ru-BY"/>
+        </w:rPr>
+        <w:t xml:space="preserve">Вендров А.М. Проектирование программного обеспечения экономических информационных систем. – М.: Финансы и статистика, 2020. </w:t>
+      </w:r>
+    </w:p>
+    <w:p>
+      <w:pPr>
+        <w:pStyle w:val="ListParagraph"/>
+        <w:numPr>
+          <w:ilvl w:val="0"/>
+          <w:numId w:val="11"/>
+        </w:numPr>
+        <w:ind w:left="0" w:firstLine="709"/>
+        <w:rPr>
+          <w:lang w:val="ru-BY"/>
+        </w:rPr>
+      </w:pPr>
+      <w:r>
+        <w:rPr>
+          <w:lang w:val="ru-BY"/>
+        </w:rPr>
+        <w:t xml:space="preserve">Голицына О.Л., Максимов Н.В., Попов И.И. Информационные системы и технологии. – М.: Форум, 2021. </w:t>
+      </w:r>
+    </w:p>
+    <w:p>
+      <w:pPr>
+        <w:pStyle w:val="ListParagraph"/>
+        <w:numPr>
+          <w:ilvl w:val="0"/>
+          <w:numId w:val="11"/>
+        </w:numPr>
+        <w:ind w:left="0" w:firstLine="709"/>
+        <w:rPr>
+          <w:lang w:val="ru-BY"/>
+        </w:rPr>
+      </w:pPr>
+      <w:r>
+        <w:rPr>
+          <w:lang w:val="ru-BY"/>
+        </w:rPr>
+        <w:t xml:space="preserve">Балдин К.В., Уткин В.Б. Информационные системы в экономике. – М.: Дашков и К, 2020. </w:t>
+      </w:r>
+    </w:p>
+    <w:p>
+      <w:pPr>
+        <w:pStyle w:val="ListParagraph"/>
+        <w:numPr>
+          <w:ilvl w:val="0"/>
+          <w:numId w:val="11"/>
+        </w:numPr>
+        <w:ind w:left="0" w:firstLine="709"/>
+        <w:rPr>
+          <w:lang w:val="ru-BY"/>
+        </w:rPr>
+      </w:pPr>
+      <w:r>
+        <w:rPr>
+          <w:lang w:val="ru-BY"/>
+        </w:rPr>
+        <w:t xml:space="preserve">Робсон М., Уллах Ф. Реинжиниринг бизнес-процессов. – М.: ЮНИТИ-ДАНА, 2019. </w:t>
+      </w:r>
+    </w:p>
+    <w:p>
+      <w:pPr>
+        <w:pStyle w:val="ListParagraph"/>
+        <w:numPr>
+          <w:ilvl w:val="0"/>
+          <w:numId w:val="11"/>
+        </w:numPr>
+        <w:ind w:left="0" w:firstLine="709"/>
+        <w:rPr>
+          <w:lang w:val="ru-BY"/>
+        </w:rPr>
+      </w:pPr>
+      <w:r>
+        <w:rPr>
+          <w:lang w:val="ru-BY"/>
+        </w:rPr>
+        <w:t xml:space="preserve">Давенпорт Т. Инновации в бизнес-процессах. – М.: Альпина Паблишер, 2020. </w:t>
+      </w:r>
+    </w:p>
+    <w:p>
+      <w:pPr>
+        <w:pStyle w:val="ListParagraph"/>
+        <w:numPr>
+          <w:ilvl w:val="0"/>
+          <w:numId w:val="11"/>
+        </w:numPr>
+        <w:ind w:left="0" w:firstLine="709"/>
+        <w:rPr>
+          <w:lang w:val="ru-BY"/>
+        </w:rPr>
+      </w:pPr>
+      <w:r>
+        <w:rPr>
+          <w:lang w:val="ru-BY"/>
+        </w:rPr>
+        <w:t xml:space="preserve">Олифер В.Г., Олифер Н.А. Компьютерные сети. Принципы, технологии, протоколы. – СПб.: Питер, 2021. </w:t>
+      </w:r>
+    </w:p>
+    <w:p>
+      <w:pPr>
+        <w:pStyle w:val="ListParagraph"/>
+        <w:numPr>
+          <w:ilvl w:val="0"/>
+          <w:numId w:val="11"/>
+        </w:numPr>
+        <w:ind w:left="0" w:firstLine="709"/>
+        <w:rPr>
+          <w:lang w:val="ru-BY"/>
+        </w:rPr>
+      </w:pPr>
+      <w:r>
+        <w:rPr>
+          <w:lang w:val="ru-BY"/>
+        </w:rPr>
+        <w:t xml:space="preserve">ITIL Foundation. Основы управления ИТ-сервисами. – М.: Эксмо, 2021. </w:t>
+      </w:r>
+    </w:p>
+    <w:p>
+      <w:pPr>
+        <w:pStyle w:val="ListParagraph"/>
+        <w:numPr>
+          <w:ilvl w:val="0"/>
+          <w:numId w:val="11"/>
+        </w:numPr>
+        <w:ind w:left="0" w:firstLine="709"/>
+        <w:rPr>
+          <w:lang w:val="ru-BY"/>
+        </w:rPr>
+      </w:pPr>
+      <w:r>
+        <w:rPr>
+          <w:lang w:val="ru-BY"/>
+        </w:rPr>
+        <w:t xml:space="preserve">COBIT 2019. Руководство по управлению и аудиту ИТ. – ISACA (русское издание), 2020. </w:t>
+      </w:r>
+    </w:p>
+    <w:p>
+      <w:pPr>
+        <w:pStyle w:val="ListParagraph"/>
+        <w:numPr>
+          <w:ilvl w:val="0"/>
+          <w:numId w:val="11"/>
+        </w:numPr>
+        <w:ind w:left="0" w:firstLine="709"/>
+      </w:pPr>
+      <w:r>
+        <w:rPr>
+          <w:lang w:val="ru-BY"/>
+        </w:rPr>
+        <w:t>Международный стандарт ISO 20022. Финансовые сообщения. – Официальный перевод, 2020.</w:t>
+      </w:r>
+    </w:p>
     <w:sectPr>
-      <w:footerReference w:type="default" r:id="rId21"/>
+      <w:footerReference w:type="default" r:id="rId23"/>
       <w:pgSz w:w="11900" w:h="16840"/>
       <w:pgMar w:top="1134" w:right="567" w:bottom="1134" w:left="1701" w:header="709" w:footer="709" w:gutter="0"/>
       <w:cols w:space="720"/>
@@ -33910,12 +35300,98 @@
 <file path=word/numbering.xml><?xml version="1.0" encoding="utf-8"?>
 <w:numbering xmlns:wpc="http://schemas.microsoft.com/office/word/2010/wordprocessingCanvas" xmlns:cx="http://schemas.microsoft.com/office/drawing/2014/chartex" xmlns:cx1="http://schemas.microsoft.com/office/drawing/2015/9/8/chartex" xmlns:cx2="http://schemas.microsoft.com/office/drawing/2015/10/21/chartex" xmlns:cx3="http://schemas.microsoft.com/office/drawing/2016/5/9/chartex" xmlns:cx4="http://schemas.microsoft.com/office/drawing/2016/5/10/chartex" xmlns:cx5="http://schemas.microsoft.com/office/drawing/2016/5/11/chartex" xmlns:cx6="http://schemas.microsoft.com/office/drawing/2016/5/12/chartex" xmlns:cx7="http://schemas.microsoft.com/office/drawing/2016/5/13/chartex" xmlns:cx8="http://schemas.microsoft.com/office/drawing/2016/5/14/chartex" xmlns:mc="http://schemas.openxmlformats.org/markup-compatibility/2006" xmlns:aink="http://schemas.microsoft.com/office/drawing/2016/ink" xmlns:am3d="http://schemas.microsoft.com/office/drawing/2017/model3d" xmlns:o="urn:schemas-microsoft-com:office:office" xmlns:oel="http://schemas.microsoft.com/office/2019/extlst" xmlns:r="http://schemas.openxmlformats.org/officeDocument/2006/relationships" xmlns:m="http://schemas.openxmlformats.org/officeDocument/2006/math" xmlns:v="urn:schemas-microsoft-com:vml" xmlns:wp14="http://schemas.microsoft.com/office/word/2010/wordprocessingDrawing" xmlns:wp="http://schemas.openxmlformats.org/drawingml/2006/wordprocessingDrawing" xmlns:w10="urn:schemas-microsoft-com:office:word" xmlns:w="http://schemas.openxmlformats.org/wordprocessingml/2006/main" xmlns:w14="http://schemas.microsoft.com/office/word/2010/wordml" xmlns:w15="http://schemas.microsoft.com/office/word/2012/wordml" xmlns:w16cex="http://schemas.microsoft.com/office/word/2018/wordml/cex" xmlns:w16cid="http://schemas.microsoft.com/office/word/2016/wordml/cid" xmlns:w16="http://schemas.microsoft.com/office/word/2018/wordml" xmlns:w16du="http://schemas.microsoft.com/office/word/2023/wordml/word16du" xmlns:w16sdtdh="http://schemas.microsoft.com/office/word/2020/wordml/sdtdatahash" xmlns:w16sdtfl="http://schemas.microsoft.com/office/word/2024/wordml/sdtformatlock" xmlns:w16se="http://schemas.microsoft.com/office/word/2015/wordml/symex" xmlns:wpg="http://schemas.microsoft.com/office/word/2010/wordprocessingGroup" xmlns:wpi="http://schemas.microsoft.com/office/word/2010/wordprocessingInk" xmlns:wne="http://schemas.microsoft.com/office/word/2006/wordml" xmlns:wps="http://schemas.microsoft.com/office/word/2010/wordprocessingShape" mc:Ignorable="w14 w15 w16se w16cid w16 w16cex w16sdtdh w16sdtfl w16du wp14">
   <w:abstractNum w:abstractNumId="0" w15:restartNumberingAfterBreak="0">
+    <w:nsid w:val="2DA01F84"/>
+    <w:multiLevelType w:val="hybridMultilevel"/>
+    <w:tmpl w:val="9F109E04"/>
+    <w:lvl w:ilvl="0" w:tplc="0C00000F">
+      <w:start w:val="1"/>
+      <w:numFmt w:val="decimal"/>
+      <w:lvlText w:val="%1."/>
+      <w:lvlJc w:val="left"/>
+      <w:pPr>
+        <w:ind w:left="1429" w:hanging="360"/>
+      </w:pPr>
+    </w:lvl>
+    <w:lvl w:ilvl="1" w:tplc="0C000019" w:tentative="1">
+      <w:start w:val="1"/>
+      <w:numFmt w:val="lowerLetter"/>
+      <w:lvlText w:val="%2."/>
+      <w:lvlJc w:val="left"/>
+      <w:pPr>
+        <w:ind w:left="2149" w:hanging="360"/>
+      </w:pPr>
+    </w:lvl>
+    <w:lvl w:ilvl="2" w:tplc="0C00001B" w:tentative="1">
+      <w:start w:val="1"/>
+      <w:numFmt w:val="lowerRoman"/>
+      <w:lvlText w:val="%3."/>
+      <w:lvlJc w:val="right"/>
+      <w:pPr>
+        <w:ind w:left="2869" w:hanging="180"/>
+      </w:pPr>
+    </w:lvl>
+    <w:lvl w:ilvl="3" w:tplc="0C00000F" w:tentative="1">
+      <w:start w:val="1"/>
+      <w:numFmt w:val="decimal"/>
+      <w:lvlText w:val="%4."/>
+      <w:lvlJc w:val="left"/>
+      <w:pPr>
+        <w:ind w:left="3589" w:hanging="360"/>
+      </w:pPr>
+    </w:lvl>
+    <w:lvl w:ilvl="4" w:tplc="0C000019" w:tentative="1">
+      <w:start w:val="1"/>
+      <w:numFmt w:val="lowerLetter"/>
+      <w:lvlText w:val="%5."/>
+      <w:lvlJc w:val="left"/>
+      <w:pPr>
+        <w:ind w:left="4309" w:hanging="360"/>
+      </w:pPr>
+    </w:lvl>
+    <w:lvl w:ilvl="5" w:tplc="0C00001B" w:tentative="1">
+      <w:start w:val="1"/>
+      <w:numFmt w:val="lowerRoman"/>
+      <w:lvlText w:val="%6."/>
+      <w:lvlJc w:val="right"/>
+      <w:pPr>
+        <w:ind w:left="5029" w:hanging="180"/>
+      </w:pPr>
+    </w:lvl>
+    <w:lvl w:ilvl="6" w:tplc="0C00000F" w:tentative="1">
+      <w:start w:val="1"/>
+      <w:numFmt w:val="decimal"/>
+      <w:lvlText w:val="%7."/>
+      <w:lvlJc w:val="left"/>
+      <w:pPr>
+        <w:ind w:left="5749" w:hanging="360"/>
+      </w:pPr>
+    </w:lvl>
+    <w:lvl w:ilvl="7" w:tplc="0C000019" w:tentative="1">
+      <w:start w:val="1"/>
+      <w:numFmt w:val="lowerLetter"/>
+      <w:lvlText w:val="%8."/>
+      <w:lvlJc w:val="left"/>
+      <w:pPr>
+        <w:ind w:left="6469" w:hanging="360"/>
+      </w:pPr>
+    </w:lvl>
+    <w:lvl w:ilvl="8" w:tplc="0C00001B" w:tentative="1">
+      <w:start w:val="1"/>
+      <w:numFmt w:val="lowerRoman"/>
+      <w:lvlText w:val="%9."/>
+      <w:lvlJc w:val="right"/>
+      <w:pPr>
+        <w:ind w:left="7189" w:hanging="180"/>
+      </w:pPr>
+    </w:lvl>
+  </w:abstractNum>
+  <w:abstractNum w:abstractNumId="1" w15:restartNumberingAfterBreak="0">
     <w:nsid w:val="2F522568"/>
     <w:multiLevelType w:val="hybridMultilevel"/>
     <w:tmpl w:val="F59CF87A"/>
     <w:numStyleLink w:val="a"/>
   </w:abstractNum>
-  <w:abstractNum w:abstractNumId="1" w15:restartNumberingAfterBreak="0">
+  <w:abstractNum w:abstractNumId="2" w15:restartNumberingAfterBreak="0">
     <w:nsid w:val="32774B12"/>
     <w:multiLevelType w:val="multilevel"/>
     <w:tmpl w:val="7D56DCBA"/>
@@ -34028,7 +35504,7 @@
       </w:pPr>
     </w:lvl>
   </w:abstractNum>
-  <w:abstractNum w:abstractNumId="2" w15:restartNumberingAfterBreak="0">
+  <w:abstractNum w:abstractNumId="3" w15:restartNumberingAfterBreak="0">
     <w:nsid w:val="3D99659D"/>
     <w:multiLevelType w:val="hybridMultilevel"/>
     <w:tmpl w:val="1FBE4350"/>
@@ -34433,13 +35909,13 @@
       </w:rPr>
     </w:lvl>
   </w:abstractNum>
-  <w:abstractNum w:abstractNumId="3" w15:restartNumberingAfterBreak="0">
+  <w:abstractNum w:abstractNumId="4" w15:restartNumberingAfterBreak="0">
     <w:nsid w:val="4A78139D"/>
     <w:multiLevelType w:val="hybridMultilevel"/>
     <w:tmpl w:val="67C8B990"/>
     <w:numStyleLink w:val="a1"/>
   </w:abstractNum>
-  <w:abstractNum w:abstractNumId="4" w15:restartNumberingAfterBreak="0">
+  <w:abstractNum w:abstractNumId="5" w15:restartNumberingAfterBreak="0">
     <w:nsid w:val="4B2F18C2"/>
     <w:multiLevelType w:val="multilevel"/>
     <w:tmpl w:val="1D687F66"/>
@@ -34552,7 +36028,7 @@
       </w:pPr>
     </w:lvl>
   </w:abstractNum>
-  <w:abstractNum w:abstractNumId="5" w15:restartNumberingAfterBreak="0">
+  <w:abstractNum w:abstractNumId="6" w15:restartNumberingAfterBreak="0">
     <w:nsid w:val="6340523A"/>
     <w:multiLevelType w:val="multilevel"/>
     <w:tmpl w:val="767E6450"/>
@@ -34701,7 +36177,7 @@
       </w:rPr>
     </w:lvl>
   </w:abstractNum>
-  <w:abstractNum w:abstractNumId="6" w15:restartNumberingAfterBreak="0">
+  <w:abstractNum w:abstractNumId="7" w15:restartNumberingAfterBreak="0">
     <w:nsid w:val="6888727C"/>
     <w:multiLevelType w:val="multilevel"/>
     <w:tmpl w:val="A5589D3C"/>
@@ -34850,7 +36326,7 @@
       </w:rPr>
     </w:lvl>
   </w:abstractNum>
-  <w:abstractNum w:abstractNumId="7" w15:restartNumberingAfterBreak="0">
+  <w:abstractNum w:abstractNumId="8" w15:restartNumberingAfterBreak="0">
     <w:nsid w:val="73C40801"/>
     <w:multiLevelType w:val="hybridMultilevel"/>
     <w:tmpl w:val="67C8B990"/>
@@ -35255,7 +36731,7 @@
       </w:rPr>
     </w:lvl>
   </w:abstractNum>
-  <w:abstractNum w:abstractNumId="8" w15:restartNumberingAfterBreak="0">
+  <w:abstractNum w:abstractNumId="9" w15:restartNumberingAfterBreak="0">
     <w:nsid w:val="75813355"/>
     <w:multiLevelType w:val="hybridMultilevel"/>
     <w:tmpl w:val="F59CF87A"/>
@@ -35662,41 +37138,44 @@
       </w:rPr>
     </w:lvl>
   </w:abstractNum>
-  <w:abstractNum w:abstractNumId="9" w15:restartNumberingAfterBreak="0">
+  <w:abstractNum w:abstractNumId="10" w15:restartNumberingAfterBreak="0">
     <w:nsid w:val="76380655"/>
     <w:multiLevelType w:val="hybridMultilevel"/>
     <w:tmpl w:val="1FBE4350"/>
     <w:numStyleLink w:val="a0"/>
   </w:abstractNum>
   <w:num w:numId="1" w16cid:durableId="77095730">
+    <w:abstractNumId w:val="3"/>
+  </w:num>
+  <w:num w:numId="2" w16cid:durableId="1189637342">
+    <w:abstractNumId w:val="10"/>
+  </w:num>
+  <w:num w:numId="3" w16cid:durableId="1705254759">
+    <w:abstractNumId w:val="9"/>
+  </w:num>
+  <w:num w:numId="4" w16cid:durableId="277834848">
+    <w:abstractNumId w:val="1"/>
+  </w:num>
+  <w:num w:numId="5" w16cid:durableId="266235583">
+    <w:abstractNumId w:val="8"/>
+  </w:num>
+  <w:num w:numId="6" w16cid:durableId="481047421">
+    <w:abstractNumId w:val="4"/>
+  </w:num>
+  <w:num w:numId="7" w16cid:durableId="1548223562">
+    <w:abstractNumId w:val="6"/>
+  </w:num>
+  <w:num w:numId="8" w16cid:durableId="1723676181">
+    <w:abstractNumId w:val="5"/>
+  </w:num>
+  <w:num w:numId="9" w16cid:durableId="1359816637">
+    <w:abstractNumId w:val="7"/>
+  </w:num>
+  <w:num w:numId="10" w16cid:durableId="943658740">
     <w:abstractNumId w:val="2"/>
   </w:num>
-  <w:num w:numId="2" w16cid:durableId="1189637342">
-    <w:abstractNumId w:val="9"/>
-  </w:num>
-  <w:num w:numId="3" w16cid:durableId="1705254759">
-    <w:abstractNumId w:val="8"/>
-  </w:num>
-  <w:num w:numId="4" w16cid:durableId="277834848">
+  <w:num w:numId="11" w16cid:durableId="1994986501">
     <w:abstractNumId w:val="0"/>
-  </w:num>
-  <w:num w:numId="5" w16cid:durableId="266235583">
-    <w:abstractNumId w:val="7"/>
-  </w:num>
-  <w:num w:numId="6" w16cid:durableId="481047421">
-    <w:abstractNumId w:val="3"/>
-  </w:num>
-  <w:num w:numId="7" w16cid:durableId="1548223562">
-    <w:abstractNumId w:val="5"/>
-  </w:num>
-  <w:num w:numId="8" w16cid:durableId="1723676181">
-    <w:abstractNumId w:val="4"/>
-  </w:num>
-  <w:num w:numId="9" w16cid:durableId="1359816637">
-    <w:abstractNumId w:val="6"/>
-  </w:num>
-  <w:num w:numId="10" w16cid:durableId="943658740">
-    <w:abstractNumId w:val="1"/>
   </w:num>
 </w:numbering>
 </file>
@@ -36432,6 +37911,18 @@
       <w:szCs w:val="28"/>
       <w:u w:color="000000"/>
       <w:lang w:val="ru-RU"/>
+    </w:rPr>
+  </w:style>
+  <w:style w:type="character" w:styleId="UnresolvedMention">
+    <w:name w:val="Unresolved Mention"/>
+    <w:basedOn w:val="DefaultParagraphFont"/>
+    <w:uiPriority w:val="99"/>
+    <w:semiHidden/>
+    <w:unhideWhenUsed/>
+    <w:rsid w:val="00F155DB"/>
+    <w:rPr>
+      <w:color w:val="605E5C"/>
+      <w:shd w:val="clear" w:color="auto" w:fill="E1DFDD"/>
     </w:rPr>
   </w:style>
 </w:styles>

</xml_diff>